<commit_message>
Report: add execution screenshots (self-test, build, tests, coverage, checks, decoding)
</commit_message>
<xml_diff>
--- a/docs/LR2_report.docx
+++ b/docs/LR2_report.docx
@@ -8912,6 +8912,392 @@
           <w:i w:val="0"/>
           <w:u w:val="none"/>
         </w:rPr>
+        <w:t>Додаток. Скриншоти виконання</w:t>
+      </w:r>
+    </w:p>
+    <w:p>
+      <w:pPr>
+        <w:spacing w:after="120"/>
+        <w:jc w:val="both"/>
+      </w:pPr>
+      <w:r>
+        <w:rPr>
+          <w:rFonts w:ascii="Times New Roman" w:hAnsi="Times New Roman"/>
+          <w:b w:val="0"/>
+          <w:i w:val="0"/>
+          <w:u w:val="none"/>
+        </w:rPr>
+        <w:t xml:space="preserve">Усі скриншоти зроблено на робочому ПК під час виконання роботи (Windows, WSL2, Docker-образ </w:t>
+      </w:r>
+      <w:r>
+        <w:rPr>
+          <w:rFonts w:ascii="Courier New" w:hAnsi="Courier New" w:eastAsia="Courier New"/>
+          <w:b w:val="0"/>
+          <w:i w:val="0"/>
+          <w:sz w:val="24"/>
+          <w:u w:val="none"/>
+        </w:rPr>
+        <w:t>stm32-build-lr2</w:t>
+      </w:r>
+      <w:r>
+        <w:rPr>
+          <w:rFonts w:ascii="Times New Roman" w:hAnsi="Times New Roman"/>
+          <w:b w:val="0"/>
+          <w:i w:val="0"/>
+          <w:u w:val="none"/>
+        </w:rPr>
+        <w:t>, VS Code з розширенням Wokwi).</w:t>
+      </w:r>
+    </w:p>
+    <w:p>
+      <w:pPr>
+        <w:keepNext/>
+        <w:spacing w:before="120"/>
+        <w:jc w:val="center"/>
+      </w:pPr>
+      <w:r>
+        <w:drawing>
+          <wp:inline xmlns:a="http://schemas.openxmlformats.org/drawingml/2006/main" xmlns:pic="http://schemas.openxmlformats.org/drawingml/2006/picture">
+            <wp:extent cx="5760000" cy="2605025"/>
+            <wp:docPr id="9" name="Picture 9"/>
+            <wp:cNvGraphicFramePr>
+              <a:graphicFrameLocks noChangeAspect="1"/>
+            </wp:cNvGraphicFramePr>
+            <a:graphic>
+              <a:graphicData uri="http://schemas.openxmlformats.org/drawingml/2006/picture">
+                <pic:pic>
+                  <pic:nvPicPr>
+                    <pic:cNvPr id="0" name="wokwi_selftest.png"/>
+                    <pic:cNvPicPr/>
+                  </pic:nvPicPr>
+                  <pic:blipFill>
+                    <a:blip r:embed="rId23"/>
+                    <a:stretch>
+                      <a:fillRect/>
+                    </a:stretch>
+                  </pic:blipFill>
+                  <pic:spPr>
+                    <a:xfrm>
+                      <a:off x="0" y="0"/>
+                      <a:ext cx="5760000" cy="2605025"/>
+                    </a:xfrm>
+                    <a:prstGeom prst="rect"/>
+                  </pic:spPr>
+                </pic:pic>
+              </a:graphicData>
+            </a:graphic>
+          </wp:inline>
+        </w:drawing>
+      </w:r>
+    </w:p>
+    <w:p>
+      <w:pPr>
+        <w:spacing w:after="200"/>
+        <w:jc w:val="center"/>
+      </w:pPr>
+      <w:r>
+        <w:rPr>
+          <w:rFonts w:ascii="Times New Roman" w:hAnsi="Times New Roman"/>
+          <w:b w:val="0"/>
+          <w:i w:val="0"/>
+          <w:u w:val="none"/>
+        </w:rPr>
+        <w:t>Рис. А.1 – Самоперевірка в Wokwi: послідовний термінал, SELFTEST RESULT pass=8 fail=0, результати DEV-перевірок MPU-6050, W25Q64, ADC, кнопки і PWM, аномалії i2c_probe 0x69 NACK та spi_mode=3 jedec=FFFFFF</w:t>
+      </w:r>
+    </w:p>
+    <w:p>
+      <w:pPr>
+        <w:keepNext/>
+        <w:spacing w:before="120"/>
+        <w:jc w:val="center"/>
+      </w:pPr>
+      <w:r>
+        <w:drawing>
+          <wp:inline xmlns:a="http://schemas.openxmlformats.org/drawingml/2006/main" xmlns:pic="http://schemas.openxmlformats.org/drawingml/2006/picture">
+            <wp:extent cx="5760000" cy="3037560"/>
+            <wp:docPr id="10" name="Picture 10"/>
+            <wp:cNvGraphicFramePr>
+              <a:graphicFrameLocks noChangeAspect="1"/>
+            </wp:cNvGraphicFramePr>
+            <a:graphic>
+              <a:graphicData uri="http://schemas.openxmlformats.org/drawingml/2006/picture">
+                <pic:pic>
+                  <pic:nvPicPr>
+                    <pic:cNvPr id="0" name="term_build.png"/>
+                    <pic:cNvPicPr/>
+                  </pic:nvPicPr>
+                  <pic:blipFill>
+                    <a:blip r:embed="rId24"/>
+                    <a:stretch>
+                      <a:fillRect/>
+                    </a:stretch>
+                  </pic:blipFill>
+                  <pic:spPr>
+                    <a:xfrm>
+                      <a:off x="0" y="0"/>
+                      <a:ext cx="5760000" cy="3037560"/>
+                    </a:xfrm>
+                    <a:prstGeom prst="rect"/>
+                  </pic:spPr>
+                </pic:pic>
+              </a:graphicData>
+            </a:graphic>
+          </wp:inline>
+        </w:drawing>
+      </w:r>
+    </w:p>
+    <w:p>
+      <w:pPr>
+        <w:spacing w:after="200"/>
+        <w:jc w:val="center"/>
+      </w:pPr>
+      <w:r>
+        <w:rPr>
+          <w:rFonts w:ascii="Times New Roman" w:hAnsi="Times New Roman"/>
+          <w:b w:val="0"/>
+          <w:i w:val="0"/>
+          <w:u w:val="none"/>
+        </w:rPr>
+        <w:t>Рис. А.2 – make build: збірка з прапорами -Wextra -Wshadow -Wpedantic -Werror, розмір прошивки text = 26568 байт</w:t>
+      </w:r>
+    </w:p>
+    <w:p>
+      <w:pPr>
+        <w:keepNext/>
+        <w:spacing w:before="120"/>
+        <w:jc w:val="center"/>
+      </w:pPr>
+      <w:r>
+        <w:drawing>
+          <wp:inline xmlns:a="http://schemas.openxmlformats.org/drawingml/2006/main" xmlns:pic="http://schemas.openxmlformats.org/drawingml/2006/picture">
+            <wp:extent cx="5760000" cy="3037560"/>
+            <wp:docPr id="11" name="Picture 11"/>
+            <wp:cNvGraphicFramePr>
+              <a:graphicFrameLocks noChangeAspect="1"/>
+            </wp:cNvGraphicFramePr>
+            <a:graphic>
+              <a:graphicData uri="http://schemas.openxmlformats.org/drawingml/2006/picture">
+                <pic:pic>
+                  <pic:nvPicPr>
+                    <pic:cNvPr id="0" name="term_test.png"/>
+                    <pic:cNvPicPr/>
+                  </pic:nvPicPr>
+                  <pic:blipFill>
+                    <a:blip r:embed="rId25"/>
+                    <a:stretch>
+                      <a:fillRect/>
+                    </a:stretch>
+                  </pic:blipFill>
+                  <pic:spPr>
+                    <a:xfrm>
+                      <a:off x="0" y="0"/>
+                      <a:ext cx="5760000" cy="3037560"/>
+                    </a:xfrm>
+                    <a:prstGeom prst="rect"/>
+                  </pic:spPr>
+                </pic:pic>
+              </a:graphicData>
+            </a:graphic>
+          </wp:inline>
+        </w:drawing>
+      </w:r>
+    </w:p>
+    <w:p>
+      <w:pPr>
+        <w:spacing w:after="200"/>
+        <w:jc w:val="center"/>
+      </w:pPr>
+      <w:r>
+        <w:rPr>
+          <w:rFonts w:ascii="Times New Roman" w:hAnsi="Times New Roman"/>
+          <w:b w:val="0"/>
+          <w:i w:val="0"/>
+          <w:u w:val="none"/>
+        </w:rPr>
+        <w:t>Рис. А.3 – make test: усі 69 перевірок пройдено, PASSED: 0 test(s) failed</w:t>
+      </w:r>
+    </w:p>
+    <w:p>
+      <w:pPr>
+        <w:keepNext/>
+        <w:spacing w:before="120"/>
+        <w:jc w:val="center"/>
+      </w:pPr>
+      <w:r>
+        <w:drawing>
+          <wp:inline xmlns:a="http://schemas.openxmlformats.org/drawingml/2006/main" xmlns:pic="http://schemas.openxmlformats.org/drawingml/2006/picture">
+            <wp:extent cx="5760000" cy="3037560"/>
+            <wp:docPr id="12" name="Picture 12"/>
+            <wp:cNvGraphicFramePr>
+              <a:graphicFrameLocks noChangeAspect="1"/>
+            </wp:cNvGraphicFramePr>
+            <a:graphic>
+              <a:graphicData uri="http://schemas.openxmlformats.org/drawingml/2006/picture">
+                <pic:pic>
+                  <pic:nvPicPr>
+                    <pic:cNvPr id="0" name="term_cov.png"/>
+                    <pic:cNvPicPr/>
+                  </pic:nvPicPr>
+                  <pic:blipFill>
+                    <a:blip r:embed="rId26"/>
+                    <a:stretch>
+                      <a:fillRect/>
+                    </a:stretch>
+                  </pic:blipFill>
+                  <pic:spPr>
+                    <a:xfrm>
+                      <a:off x="0" y="0"/>
+                      <a:ext cx="5760000" cy="3037560"/>
+                    </a:xfrm>
+                    <a:prstGeom prst="rect"/>
+                  </pic:spPr>
+                </pic:pic>
+              </a:graphicData>
+            </a:graphic>
+          </wp:inline>
+        </w:drawing>
+      </w:r>
+    </w:p>
+    <w:p>
+      <w:pPr>
+        <w:spacing w:after="200"/>
+        <w:jc w:val="center"/>
+      </w:pPr>
+      <w:r>
+        <w:rPr>
+          <w:rFonts w:ascii="Times New Roman" w:hAnsi="Times New Roman"/>
+          <w:b w:val="0"/>
+          <w:i w:val="0"/>
+          <w:u w:val="none"/>
+        </w:rPr>
+        <w:t>Рис. А.4 – make coverage: покриття 95.4 % рядків і 77.9 % гілок, пороги 90 % / 70 % виконано</w:t>
+      </w:r>
+    </w:p>
+    <w:p>
+      <w:pPr>
+        <w:keepNext/>
+        <w:spacing w:before="120"/>
+        <w:jc w:val="center"/>
+      </w:pPr>
+      <w:r>
+        <w:drawing>
+          <wp:inline xmlns:a="http://schemas.openxmlformats.org/drawingml/2006/main" xmlns:pic="http://schemas.openxmlformats.org/drawingml/2006/picture">
+            <wp:extent cx="5760000" cy="3037560"/>
+            <wp:docPr id="13" name="Picture 13"/>
+            <wp:cNvGraphicFramePr>
+              <a:graphicFrameLocks noChangeAspect="1"/>
+            </wp:cNvGraphicFramePr>
+            <a:graphic>
+              <a:graphicData uri="http://schemas.openxmlformats.org/drawingml/2006/picture">
+                <pic:pic>
+                  <pic:nvPicPr>
+                    <pic:cNvPr id="0" name="term_check.png"/>
+                    <pic:cNvPicPr/>
+                  </pic:nvPicPr>
+                  <pic:blipFill>
+                    <a:blip r:embed="rId27"/>
+                    <a:stretch>
+                      <a:fillRect/>
+                    </a:stretch>
+                  </pic:blipFill>
+                  <pic:spPr>
+                    <a:xfrm>
+                      <a:off x="0" y="0"/>
+                      <a:ext cx="5760000" cy="3037560"/>
+                    </a:xfrm>
+                    <a:prstGeom prst="rect"/>
+                  </pic:spPr>
+                </pic:pic>
+              </a:graphicData>
+            </a:graphic>
+          </wp:inline>
+        </w:drawing>
+      </w:r>
+    </w:p>
+    <w:p>
+      <w:pPr>
+        <w:spacing w:after="200"/>
+        <w:jc w:val="center"/>
+      </w:pPr>
+      <w:r>
+        <w:rPr>
+          <w:rFonts w:ascii="Times New Roman" w:hAnsi="Times New Roman"/>
+          <w:b w:val="0"/>
+          <w:i w:val="0"/>
+          <w:u w:val="none"/>
+        </w:rPr>
+        <w:t>Рис. А.5 – make check: правила залежностей шарів, самоперевірка перевірки (2 навмисні порушення виявлено), check-pinout: 14 rows, 0 errors; історія комітів гілки lab2</w:t>
+      </w:r>
+    </w:p>
+    <w:p>
+      <w:pPr>
+        <w:keepNext/>
+        <w:spacing w:before="120"/>
+        <w:jc w:val="center"/>
+      </w:pPr>
+      <w:r>
+        <w:drawing>
+          <wp:inline xmlns:a="http://schemas.openxmlformats.org/drawingml/2006/main" xmlns:pic="http://schemas.openxmlformats.org/drawingml/2006/picture">
+            <wp:extent cx="5760000" cy="2159354"/>
+            <wp:docPr id="14" name="Picture 14"/>
+            <wp:cNvGraphicFramePr>
+              <a:graphicFrameLocks noChangeAspect="1"/>
+            </wp:cNvGraphicFramePr>
+            <a:graphic>
+              <a:graphicData uri="http://schemas.openxmlformats.org/drawingml/2006/picture">
+                <pic:pic>
+                  <pic:nvPicPr>
+                    <pic:cNvPr id="0" name="term_decode.png"/>
+                    <pic:cNvPicPr/>
+                  </pic:nvPicPr>
+                  <pic:blipFill>
+                    <a:blip r:embed="rId28"/>
+                    <a:stretch>
+                      <a:fillRect/>
+                    </a:stretch>
+                  </pic:blipFill>
+                  <pic:spPr>
+                    <a:xfrm>
+                      <a:off x="0" y="0"/>
+                      <a:ext cx="5760000" cy="2159354"/>
+                    </a:xfrm>
+                    <a:prstGeom prst="rect"/>
+                  </pic:spPr>
+                </pic:pic>
+              </a:graphicData>
+            </a:graphic>
+          </wp:inline>
+        </w:drawing>
+      </w:r>
+    </w:p>
+    <w:p>
+      <w:pPr>
+        <w:spacing w:after="200"/>
+        <w:jc w:val="center"/>
+      </w:pPr>
+      <w:r>
+        <w:rPr>
+          <w:rFonts w:ascii="Times New Roman" w:hAnsi="Times New Roman"/>
+          <w:b w:val="0"/>
+          <w:i w:val="0"/>
+          <w:u w:val="none"/>
+        </w:rPr>
+        <w:t>Рис. А.6 – Декодування записів логічного аналізатора через sigrok-cli: I2C (WHO_AM_I, адреса 0x68) і SPI (JEDEC ID: 0xEF, 0x40, 0x17)</w:t>
+      </w:r>
+    </w:p>
+    <w:p>
+      <w:pPr>
+        <w:keepNext/>
+        <w:spacing w:after="160"/>
+        <w:jc w:val="center"/>
+      </w:pPr>
+      <w:r>
+        <w:rPr>
+          <w:rFonts w:ascii="Times New Roman" w:hAnsi="Times New Roman"/>
+          <w:b/>
+          <w:i w:val="0"/>
+          <w:u w:val="none"/>
+        </w:rPr>
         <w:t>Матеріали та посилання</w:t>
       </w:r>
     </w:p>
@@ -9140,7 +9526,7 @@
       </w:r>
     </w:p>
     <w:sectPr>
-      <w:footerReference w:type="default" r:id="rId23"/>
+      <w:footerReference w:type="default" r:id="rId29"/>
       <w:pgSz w:w="11906" w:h="16838"/>
       <w:pgMar w:top="1134" w:right="850" w:bottom="1134" w:left="1417" w:header="720" w:footer="720" w:gutter="0"/>
       <w:cols w:space="720"/>

</xml_diff>

<commit_message>
Report: add Wokwi wiring and CubeMX configuration screenshots
</commit_message>
<xml_diff>
--- a/docs/LR2_report.docx
+++ b/docs/LR2_report.docx
@@ -8958,8 +8958,176 @@
       <w:r>
         <w:drawing>
           <wp:inline xmlns:a="http://schemas.openxmlformats.org/drawingml/2006/main" xmlns:pic="http://schemas.openxmlformats.org/drawingml/2006/picture">
+            <wp:extent cx="5760000" cy="3188571"/>
+            <wp:docPr id="9" name="Picture 9"/>
+            <wp:cNvGraphicFramePr>
+              <a:graphicFrameLocks noChangeAspect="1"/>
+            </wp:cNvGraphicFramePr>
+            <a:graphic>
+              <a:graphicData uri="http://schemas.openxmlformats.org/drawingml/2006/picture">
+                <pic:pic>
+                  <pic:nvPicPr>
+                    <pic:cNvPr id="0" name="wokwi_diagram.png"/>
+                    <pic:cNvPicPr/>
+                  </pic:nvPicPr>
+                  <pic:blipFill>
+                    <a:blip r:embed="rId23"/>
+                    <a:stretch>
+                      <a:fillRect/>
+                    </a:stretch>
+                  </pic:blipFill>
+                  <pic:spPr>
+                    <a:xfrm>
+                      <a:off x="0" y="0"/>
+                      <a:ext cx="5760000" cy="3188571"/>
+                    </a:xfrm>
+                    <a:prstGeom prst="rect"/>
+                  </pic:spPr>
+                </pic:pic>
+              </a:graphicData>
+            </a:graphic>
+          </wp:inline>
+        </w:drawing>
+      </w:r>
+    </w:p>
+    <w:p>
+      <w:pPr>
+        <w:spacing w:after="200"/>
+        <w:jc w:val="center"/>
+      </w:pPr>
+      <w:r>
+        <w:rPr>
+          <w:rFonts w:ascii="Times New Roman" w:hAnsi="Times New Roman"/>
+          <w:b w:val="0"/>
+          <w:i w:val="0"/>
+          <w:u w:val="none"/>
+        </w:rPr>
+        <w:t>Рис. А.1 – Схема підключення у Wokwi: NUCLEO-C031C6, MPU-6050 (I2C), W25Q64 (SPI), два сервоприводи, потенціометр, кнопка і логічний аналізатор Wokwi Logic</w:t>
+      </w:r>
+    </w:p>
+    <w:p>
+      <w:pPr>
+        <w:keepNext/>
+        <w:spacing w:before="120"/>
+        <w:jc w:val="center"/>
+      </w:pPr>
+      <w:r>
+        <w:drawing>
+          <wp:inline xmlns:a="http://schemas.openxmlformats.org/drawingml/2006/main" xmlns:pic="http://schemas.openxmlformats.org/drawingml/2006/picture">
+            <wp:extent cx="5760000" cy="3235955"/>
+            <wp:docPr id="10" name="Picture 10"/>
+            <wp:cNvGraphicFramePr>
+              <a:graphicFrameLocks noChangeAspect="1"/>
+            </wp:cNvGraphicFramePr>
+            <a:graphic>
+              <a:graphicData uri="http://schemas.openxmlformats.org/drawingml/2006/picture">
+                <pic:pic>
+                  <pic:nvPicPr>
+                    <pic:cNvPr id="0" name="cubemx_pinout.png"/>
+                    <pic:cNvPicPr/>
+                  </pic:nvPicPr>
+                  <pic:blipFill>
+                    <a:blip r:embed="rId24"/>
+                    <a:stretch>
+                      <a:fillRect/>
+                    </a:stretch>
+                  </pic:blipFill>
+                  <pic:spPr>
+                    <a:xfrm>
+                      <a:off x="0" y="0"/>
+                      <a:ext cx="5760000" cy="3235955"/>
+                    </a:xfrm>
+                    <a:prstGeom prst="rect"/>
+                  </pic:spPr>
+                </pic:pic>
+              </a:graphicData>
+            </a:graphic>
+          </wp:inline>
+        </w:drawing>
+      </w:r>
+    </w:p>
+    <w:p>
+      <w:pPr>
+        <w:spacing w:after="200"/>
+        <w:jc w:val="center"/>
+      </w:pPr>
+      <w:r>
+        <w:rPr>
+          <w:rFonts w:ascii="Times New Roman" w:hAnsi="Times New Roman"/>
+          <w:b w:val="0"/>
+          <w:i w:val="0"/>
+          <w:u w:val="none"/>
+        </w:rPr>
+        <w:t>Рис. А.2 – STM32CubeMX, Pinout view: I2C1 (PA9/PA10), SPI1 (PB3/PB4/PB5), USART2 (PA2/PA3), TIM3 CH1/CH2 (PA6/PA7), ADC1_IN0 (PA0), FLASH_CS (PB0), MARKER (PB1), LED (PA5), BUTTON (PC13)</w:t>
+      </w:r>
+    </w:p>
+    <w:p>
+      <w:pPr>
+        <w:keepNext/>
+        <w:spacing w:before="120"/>
+        <w:jc w:val="center"/>
+      </w:pPr>
+      <w:r>
+        <w:drawing>
+          <wp:inline xmlns:a="http://schemas.openxmlformats.org/drawingml/2006/main" xmlns:pic="http://schemas.openxmlformats.org/drawingml/2006/picture">
+            <wp:extent cx="5760000" cy="3235955"/>
+            <wp:docPr id="11" name="Picture 11"/>
+            <wp:cNvGraphicFramePr>
+              <a:graphicFrameLocks noChangeAspect="1"/>
+            </wp:cNvGraphicFramePr>
+            <a:graphic>
+              <a:graphicData uri="http://schemas.openxmlformats.org/drawingml/2006/picture">
+                <pic:pic>
+                  <pic:nvPicPr>
+                    <pic:cNvPr id="0" name="cubemx_clock.png"/>
+                    <pic:cNvPicPr/>
+                  </pic:nvPicPr>
+                  <pic:blipFill>
+                    <a:blip r:embed="rId25"/>
+                    <a:stretch>
+                      <a:fillRect/>
+                    </a:stretch>
+                  </pic:blipFill>
+                  <pic:spPr>
+                    <a:xfrm>
+                      <a:off x="0" y="0"/>
+                      <a:ext cx="5760000" cy="3235955"/>
+                    </a:xfrm>
+                    <a:prstGeom prst="rect"/>
+                  </pic:spPr>
+                </pic:pic>
+              </a:graphicData>
+            </a:graphic>
+          </wp:inline>
+        </w:drawing>
+      </w:r>
+    </w:p>
+    <w:p>
+      <w:pPr>
+        <w:spacing w:after="200"/>
+        <w:jc w:val="center"/>
+      </w:pPr>
+      <w:r>
+        <w:rPr>
+          <w:rFonts w:ascii="Times New Roman" w:hAnsi="Times New Roman"/>
+          <w:b w:val="0"/>
+          <w:i w:val="0"/>
+          <w:u w:val="none"/>
+        </w:rPr>
+        <w:t>Рис. А.3 – STM32CubeMX, Clock Configuration: HSI48 → SYSCLK = HCLK = 48 МГц, APB = 48 МГц</w:t>
+      </w:r>
+    </w:p>
+    <w:p>
+      <w:pPr>
+        <w:keepNext/>
+        <w:spacing w:before="120"/>
+        <w:jc w:val="center"/>
+      </w:pPr>
+      <w:r>
+        <w:drawing>
+          <wp:inline xmlns:a="http://schemas.openxmlformats.org/drawingml/2006/main" xmlns:pic="http://schemas.openxmlformats.org/drawingml/2006/picture">
             <wp:extent cx="5760000" cy="2605025"/>
-            <wp:docPr id="9" name="Picture 9"/>
+            <wp:docPr id="12" name="Picture 12"/>
             <wp:cNvGraphicFramePr>
               <a:graphicFrameLocks noChangeAspect="1"/>
             </wp:cNvGraphicFramePr>
@@ -8971,7 +9139,7 @@
                     <pic:cNvPicPr/>
                   </pic:nvPicPr>
                   <pic:blipFill>
-                    <a:blip r:embed="rId23"/>
+                    <a:blip r:embed="rId26"/>
                     <a:stretch>
                       <a:fillRect/>
                     </a:stretch>
@@ -9002,175 +9170,7 @@
           <w:i w:val="0"/>
           <w:u w:val="none"/>
         </w:rPr>
-        <w:t>Рис. А.1 – Самоперевірка в Wokwi: послідовний термінал, SELFTEST RESULT pass=8 fail=0, результати DEV-перевірок MPU-6050, W25Q64, ADC, кнопки і PWM, аномалії i2c_probe 0x69 NACK та spi_mode=3 jedec=FFFFFF</w:t>
-      </w:r>
-    </w:p>
-    <w:p>
-      <w:pPr>
-        <w:keepNext/>
-        <w:spacing w:before="120"/>
-        <w:jc w:val="center"/>
-      </w:pPr>
-      <w:r>
-        <w:drawing>
-          <wp:inline xmlns:a="http://schemas.openxmlformats.org/drawingml/2006/main" xmlns:pic="http://schemas.openxmlformats.org/drawingml/2006/picture">
-            <wp:extent cx="5760000" cy="3037560"/>
-            <wp:docPr id="10" name="Picture 10"/>
-            <wp:cNvGraphicFramePr>
-              <a:graphicFrameLocks noChangeAspect="1"/>
-            </wp:cNvGraphicFramePr>
-            <a:graphic>
-              <a:graphicData uri="http://schemas.openxmlformats.org/drawingml/2006/picture">
-                <pic:pic>
-                  <pic:nvPicPr>
-                    <pic:cNvPr id="0" name="term_build.png"/>
-                    <pic:cNvPicPr/>
-                  </pic:nvPicPr>
-                  <pic:blipFill>
-                    <a:blip r:embed="rId24"/>
-                    <a:stretch>
-                      <a:fillRect/>
-                    </a:stretch>
-                  </pic:blipFill>
-                  <pic:spPr>
-                    <a:xfrm>
-                      <a:off x="0" y="0"/>
-                      <a:ext cx="5760000" cy="3037560"/>
-                    </a:xfrm>
-                    <a:prstGeom prst="rect"/>
-                  </pic:spPr>
-                </pic:pic>
-              </a:graphicData>
-            </a:graphic>
-          </wp:inline>
-        </w:drawing>
-      </w:r>
-    </w:p>
-    <w:p>
-      <w:pPr>
-        <w:spacing w:after="200"/>
-        <w:jc w:val="center"/>
-      </w:pPr>
-      <w:r>
-        <w:rPr>
-          <w:rFonts w:ascii="Times New Roman" w:hAnsi="Times New Roman"/>
-          <w:b w:val="0"/>
-          <w:i w:val="0"/>
-          <w:u w:val="none"/>
-        </w:rPr>
-        <w:t>Рис. А.2 – make build: збірка з прапорами -Wextra -Wshadow -Wpedantic -Werror, розмір прошивки text = 26568 байт</w:t>
-      </w:r>
-    </w:p>
-    <w:p>
-      <w:pPr>
-        <w:keepNext/>
-        <w:spacing w:before="120"/>
-        <w:jc w:val="center"/>
-      </w:pPr>
-      <w:r>
-        <w:drawing>
-          <wp:inline xmlns:a="http://schemas.openxmlformats.org/drawingml/2006/main" xmlns:pic="http://schemas.openxmlformats.org/drawingml/2006/picture">
-            <wp:extent cx="5760000" cy="3037560"/>
-            <wp:docPr id="11" name="Picture 11"/>
-            <wp:cNvGraphicFramePr>
-              <a:graphicFrameLocks noChangeAspect="1"/>
-            </wp:cNvGraphicFramePr>
-            <a:graphic>
-              <a:graphicData uri="http://schemas.openxmlformats.org/drawingml/2006/picture">
-                <pic:pic>
-                  <pic:nvPicPr>
-                    <pic:cNvPr id="0" name="term_test.png"/>
-                    <pic:cNvPicPr/>
-                  </pic:nvPicPr>
-                  <pic:blipFill>
-                    <a:blip r:embed="rId25"/>
-                    <a:stretch>
-                      <a:fillRect/>
-                    </a:stretch>
-                  </pic:blipFill>
-                  <pic:spPr>
-                    <a:xfrm>
-                      <a:off x="0" y="0"/>
-                      <a:ext cx="5760000" cy="3037560"/>
-                    </a:xfrm>
-                    <a:prstGeom prst="rect"/>
-                  </pic:spPr>
-                </pic:pic>
-              </a:graphicData>
-            </a:graphic>
-          </wp:inline>
-        </w:drawing>
-      </w:r>
-    </w:p>
-    <w:p>
-      <w:pPr>
-        <w:spacing w:after="200"/>
-        <w:jc w:val="center"/>
-      </w:pPr>
-      <w:r>
-        <w:rPr>
-          <w:rFonts w:ascii="Times New Roman" w:hAnsi="Times New Roman"/>
-          <w:b w:val="0"/>
-          <w:i w:val="0"/>
-          <w:u w:val="none"/>
-        </w:rPr>
-        <w:t>Рис. А.3 – make test: усі 69 перевірок пройдено, PASSED: 0 test(s) failed</w:t>
-      </w:r>
-    </w:p>
-    <w:p>
-      <w:pPr>
-        <w:keepNext/>
-        <w:spacing w:before="120"/>
-        <w:jc w:val="center"/>
-      </w:pPr>
-      <w:r>
-        <w:drawing>
-          <wp:inline xmlns:a="http://schemas.openxmlformats.org/drawingml/2006/main" xmlns:pic="http://schemas.openxmlformats.org/drawingml/2006/picture">
-            <wp:extent cx="5760000" cy="3037560"/>
-            <wp:docPr id="12" name="Picture 12"/>
-            <wp:cNvGraphicFramePr>
-              <a:graphicFrameLocks noChangeAspect="1"/>
-            </wp:cNvGraphicFramePr>
-            <a:graphic>
-              <a:graphicData uri="http://schemas.openxmlformats.org/drawingml/2006/picture">
-                <pic:pic>
-                  <pic:nvPicPr>
-                    <pic:cNvPr id="0" name="term_cov.png"/>
-                    <pic:cNvPicPr/>
-                  </pic:nvPicPr>
-                  <pic:blipFill>
-                    <a:blip r:embed="rId26"/>
-                    <a:stretch>
-                      <a:fillRect/>
-                    </a:stretch>
-                  </pic:blipFill>
-                  <pic:spPr>
-                    <a:xfrm>
-                      <a:off x="0" y="0"/>
-                      <a:ext cx="5760000" cy="3037560"/>
-                    </a:xfrm>
-                    <a:prstGeom prst="rect"/>
-                  </pic:spPr>
-                </pic:pic>
-              </a:graphicData>
-            </a:graphic>
-          </wp:inline>
-        </w:drawing>
-      </w:r>
-    </w:p>
-    <w:p>
-      <w:pPr>
-        <w:spacing w:after="200"/>
-        <w:jc w:val="center"/>
-      </w:pPr>
-      <w:r>
-        <w:rPr>
-          <w:rFonts w:ascii="Times New Roman" w:hAnsi="Times New Roman"/>
-          <w:b w:val="0"/>
-          <w:i w:val="0"/>
-          <w:u w:val="none"/>
-        </w:rPr>
-        <w:t>Рис. А.4 – make coverage: покриття 95.4 % рядків і 77.9 % гілок, пороги 90 % / 70 % виконано</w:t>
+        <w:t>Рис. А.4 – Самоперевірка в Wokwi: послідовний термінал, SELFTEST RESULT pass=8 fail=0, результати DEV-перевірок MPU-6050, W25Q64, ADC, кнопки і PWM, аномалії i2c_probe 0x69 NACK та spi_mode=3 jedec=FFFFFF</w:t>
       </w:r>
     </w:p>
     <w:p>
@@ -9191,7 +9191,7 @@
               <a:graphicData uri="http://schemas.openxmlformats.org/drawingml/2006/picture">
                 <pic:pic>
                   <pic:nvPicPr>
-                    <pic:cNvPr id="0" name="term_check.png"/>
+                    <pic:cNvPr id="0" name="term_build.png"/>
                     <pic:cNvPicPr/>
                   </pic:nvPicPr>
                   <pic:blipFill>
@@ -9226,7 +9226,7 @@
           <w:i w:val="0"/>
           <w:u w:val="none"/>
         </w:rPr>
-        <w:t>Рис. А.5 – make check: правила залежностей шарів, самоперевірка перевірки (2 навмисні порушення виявлено), check-pinout: 14 rows, 0 errors; історія комітів гілки lab2</w:t>
+        <w:t>Рис. А.5 – make build: збірка з прапорами -Wextra -Wshadow -Wpedantic -Werror, розмір прошивки text = 26568 байт</w:t>
       </w:r>
     </w:p>
     <w:p>
@@ -9238,8 +9238,176 @@
       <w:r>
         <w:drawing>
           <wp:inline xmlns:a="http://schemas.openxmlformats.org/drawingml/2006/main" xmlns:pic="http://schemas.openxmlformats.org/drawingml/2006/picture">
+            <wp:extent cx="5760000" cy="3037560"/>
+            <wp:docPr id="14" name="Picture 14"/>
+            <wp:cNvGraphicFramePr>
+              <a:graphicFrameLocks noChangeAspect="1"/>
+            </wp:cNvGraphicFramePr>
+            <a:graphic>
+              <a:graphicData uri="http://schemas.openxmlformats.org/drawingml/2006/picture">
+                <pic:pic>
+                  <pic:nvPicPr>
+                    <pic:cNvPr id="0" name="term_test.png"/>
+                    <pic:cNvPicPr/>
+                  </pic:nvPicPr>
+                  <pic:blipFill>
+                    <a:blip r:embed="rId28"/>
+                    <a:stretch>
+                      <a:fillRect/>
+                    </a:stretch>
+                  </pic:blipFill>
+                  <pic:spPr>
+                    <a:xfrm>
+                      <a:off x="0" y="0"/>
+                      <a:ext cx="5760000" cy="3037560"/>
+                    </a:xfrm>
+                    <a:prstGeom prst="rect"/>
+                  </pic:spPr>
+                </pic:pic>
+              </a:graphicData>
+            </a:graphic>
+          </wp:inline>
+        </w:drawing>
+      </w:r>
+    </w:p>
+    <w:p>
+      <w:pPr>
+        <w:spacing w:after="200"/>
+        <w:jc w:val="center"/>
+      </w:pPr>
+      <w:r>
+        <w:rPr>
+          <w:rFonts w:ascii="Times New Roman" w:hAnsi="Times New Roman"/>
+          <w:b w:val="0"/>
+          <w:i w:val="0"/>
+          <w:u w:val="none"/>
+        </w:rPr>
+        <w:t>Рис. А.6 – make test: усі 69 перевірок пройдено, PASSED: 0 test(s) failed</w:t>
+      </w:r>
+    </w:p>
+    <w:p>
+      <w:pPr>
+        <w:keepNext/>
+        <w:spacing w:before="120"/>
+        <w:jc w:val="center"/>
+      </w:pPr>
+      <w:r>
+        <w:drawing>
+          <wp:inline xmlns:a="http://schemas.openxmlformats.org/drawingml/2006/main" xmlns:pic="http://schemas.openxmlformats.org/drawingml/2006/picture">
+            <wp:extent cx="5760000" cy="3037560"/>
+            <wp:docPr id="15" name="Picture 15"/>
+            <wp:cNvGraphicFramePr>
+              <a:graphicFrameLocks noChangeAspect="1"/>
+            </wp:cNvGraphicFramePr>
+            <a:graphic>
+              <a:graphicData uri="http://schemas.openxmlformats.org/drawingml/2006/picture">
+                <pic:pic>
+                  <pic:nvPicPr>
+                    <pic:cNvPr id="0" name="term_cov.png"/>
+                    <pic:cNvPicPr/>
+                  </pic:nvPicPr>
+                  <pic:blipFill>
+                    <a:blip r:embed="rId29"/>
+                    <a:stretch>
+                      <a:fillRect/>
+                    </a:stretch>
+                  </pic:blipFill>
+                  <pic:spPr>
+                    <a:xfrm>
+                      <a:off x="0" y="0"/>
+                      <a:ext cx="5760000" cy="3037560"/>
+                    </a:xfrm>
+                    <a:prstGeom prst="rect"/>
+                  </pic:spPr>
+                </pic:pic>
+              </a:graphicData>
+            </a:graphic>
+          </wp:inline>
+        </w:drawing>
+      </w:r>
+    </w:p>
+    <w:p>
+      <w:pPr>
+        <w:spacing w:after="200"/>
+        <w:jc w:val="center"/>
+      </w:pPr>
+      <w:r>
+        <w:rPr>
+          <w:rFonts w:ascii="Times New Roman" w:hAnsi="Times New Roman"/>
+          <w:b w:val="0"/>
+          <w:i w:val="0"/>
+          <w:u w:val="none"/>
+        </w:rPr>
+        <w:t>Рис. А.7 – make coverage: покриття 95.4 % рядків і 77.9 % гілок, пороги 90 % / 70 % виконано</w:t>
+      </w:r>
+    </w:p>
+    <w:p>
+      <w:pPr>
+        <w:keepNext/>
+        <w:spacing w:before="120"/>
+        <w:jc w:val="center"/>
+      </w:pPr>
+      <w:r>
+        <w:drawing>
+          <wp:inline xmlns:a="http://schemas.openxmlformats.org/drawingml/2006/main" xmlns:pic="http://schemas.openxmlformats.org/drawingml/2006/picture">
+            <wp:extent cx="5760000" cy="3037560"/>
+            <wp:docPr id="16" name="Picture 16"/>
+            <wp:cNvGraphicFramePr>
+              <a:graphicFrameLocks noChangeAspect="1"/>
+            </wp:cNvGraphicFramePr>
+            <a:graphic>
+              <a:graphicData uri="http://schemas.openxmlformats.org/drawingml/2006/picture">
+                <pic:pic>
+                  <pic:nvPicPr>
+                    <pic:cNvPr id="0" name="term_check.png"/>
+                    <pic:cNvPicPr/>
+                  </pic:nvPicPr>
+                  <pic:blipFill>
+                    <a:blip r:embed="rId30"/>
+                    <a:stretch>
+                      <a:fillRect/>
+                    </a:stretch>
+                  </pic:blipFill>
+                  <pic:spPr>
+                    <a:xfrm>
+                      <a:off x="0" y="0"/>
+                      <a:ext cx="5760000" cy="3037560"/>
+                    </a:xfrm>
+                    <a:prstGeom prst="rect"/>
+                  </pic:spPr>
+                </pic:pic>
+              </a:graphicData>
+            </a:graphic>
+          </wp:inline>
+        </w:drawing>
+      </w:r>
+    </w:p>
+    <w:p>
+      <w:pPr>
+        <w:spacing w:after="200"/>
+        <w:jc w:val="center"/>
+      </w:pPr>
+      <w:r>
+        <w:rPr>
+          <w:rFonts w:ascii="Times New Roman" w:hAnsi="Times New Roman"/>
+          <w:b w:val="0"/>
+          <w:i w:val="0"/>
+          <w:u w:val="none"/>
+        </w:rPr>
+        <w:t>Рис. А.8 – make check: правила залежностей шарів, самоперевірка перевірки (2 навмисні порушення виявлено), check-pinout: 14 rows, 0 errors; історія комітів гілки lab2</w:t>
+      </w:r>
+    </w:p>
+    <w:p>
+      <w:pPr>
+        <w:keepNext/>
+        <w:spacing w:before="120"/>
+        <w:jc w:val="center"/>
+      </w:pPr>
+      <w:r>
+        <w:drawing>
+          <wp:inline xmlns:a="http://schemas.openxmlformats.org/drawingml/2006/main" xmlns:pic="http://schemas.openxmlformats.org/drawingml/2006/picture">
             <wp:extent cx="5760000" cy="2159354"/>
-            <wp:docPr id="14" name="Picture 14"/>
+            <wp:docPr id="17" name="Picture 17"/>
             <wp:cNvGraphicFramePr>
               <a:graphicFrameLocks noChangeAspect="1"/>
             </wp:cNvGraphicFramePr>
@@ -9251,7 +9419,7 @@
                     <pic:cNvPicPr/>
                   </pic:nvPicPr>
                   <pic:blipFill>
-                    <a:blip r:embed="rId28"/>
+                    <a:blip r:embed="rId31"/>
                     <a:stretch>
                       <a:fillRect/>
                     </a:stretch>
@@ -9282,7 +9450,7 @@
           <w:i w:val="0"/>
           <w:u w:val="none"/>
         </w:rPr>
-        <w:t>Рис. А.6 – Декодування записів логічного аналізатора через sigrok-cli: I2C (WHO_AM_I, адреса 0x68) і SPI (JEDEC ID: 0xEF, 0x40, 0x17)</w:t>
+        <w:t>Рис. А.9 – Декодування записів логічного аналізатора через sigrok-cli: I2C (WHO_AM_I, адреса 0x68) і SPI (JEDEC ID: 0xEF, 0x40, 0x17)</w:t>
       </w:r>
     </w:p>
     <w:p>
@@ -9526,7 +9694,7 @@
       </w:r>
     </w:p>
     <w:sectPr>
-      <w:footerReference w:type="default" r:id="rId29"/>
+      <w:footerReference w:type="default" r:id="rId32"/>
       <w:pgSz w:w="11906" w:h="16838"/>
       <w:pgMar w:top="1134" w:right="850" w:bottom="1134" w:left="1417" w:header="720" w:footer="720" w:gutter="0"/>
       <w:cols w:space="720"/>

</xml_diff>

<commit_message>
Report: retake full-size screenshots (CubeMX, Wokwi, terminal output) and cap figure height
</commit_message>
<xml_diff>
--- a/docs/LR2_report.docx
+++ b/docs/LR2_report.docx
@@ -8927,26 +8927,7 @@
           <w:i w:val="0"/>
           <w:u w:val="none"/>
         </w:rPr>
-        <w:t xml:space="preserve">Усі скриншоти зроблено на робочому ПК під час виконання роботи (Windows, WSL2, Docker-образ </w:t>
-      </w:r>
-      <w:r>
-        <w:rPr>
-          <w:rFonts w:ascii="Courier New" w:hAnsi="Courier New" w:eastAsia="Courier New"/>
-          <w:b w:val="0"/>
-          <w:i w:val="0"/>
-          <w:sz w:val="24"/>
-          <w:u w:val="none"/>
-        </w:rPr>
-        <w:t>stm32-build-lr2</w:t>
-      </w:r>
-      <w:r>
-        <w:rPr>
-          <w:rFonts w:ascii="Times New Roman" w:hAnsi="Times New Roman"/>
-          <w:b w:val="0"/>
-          <w:i w:val="0"/>
-          <w:u w:val="none"/>
-        </w:rPr>
-        <w:t>, VS Code з розширенням Wokwi).</w:t>
+        <w:t>Усі скриншоти зроблено на робочому ПК під час виконання роботи (Windows, WSL2, Docker-образ stm32-build-lr2, VS Code з розширенням Wokwi, STM32CubeMX).</w:t>
       </w:r>
     </w:p>
     <w:p>
@@ -8958,7 +8939,7 @@
       <w:r>
         <w:drawing>
           <wp:inline xmlns:a="http://schemas.openxmlformats.org/drawingml/2006/main" xmlns:pic="http://schemas.openxmlformats.org/drawingml/2006/picture">
-            <wp:extent cx="5760000" cy="3188571"/>
+            <wp:extent cx="5760000" cy="3244557"/>
             <wp:docPr id="9" name="Picture 9"/>
             <wp:cNvGraphicFramePr>
               <a:graphicFrameLocks noChangeAspect="1"/>
@@ -8979,7 +8960,7 @@
                   <pic:spPr>
                     <a:xfrm>
                       <a:off x="0" y="0"/>
-                      <a:ext cx="5760000" cy="3188571"/>
+                      <a:ext cx="5760000" cy="3244557"/>
                     </a:xfrm>
                     <a:prstGeom prst="rect"/>
                   </pic:spPr>
@@ -9014,8 +8995,64 @@
       <w:r>
         <w:drawing>
           <wp:inline xmlns:a="http://schemas.openxmlformats.org/drawingml/2006/main" xmlns:pic="http://schemas.openxmlformats.org/drawingml/2006/picture">
-            <wp:extent cx="5760000" cy="3235955"/>
+            <wp:extent cx="5760000" cy="3481519"/>
             <wp:docPr id="10" name="Picture 10"/>
+            <wp:cNvGraphicFramePr>
+              <a:graphicFrameLocks noChangeAspect="1"/>
+            </wp:cNvGraphicFramePr>
+            <a:graphic>
+              <a:graphicData uri="http://schemas.openxmlformats.org/drawingml/2006/picture">
+                <pic:pic>
+                  <pic:nvPicPr>
+                    <pic:cNvPr id="0" name="wokwi_selftest.png"/>
+                    <pic:cNvPicPr/>
+                  </pic:nvPicPr>
+                  <pic:blipFill>
+                    <a:blip r:embed="rId24"/>
+                    <a:stretch>
+                      <a:fillRect/>
+                    </a:stretch>
+                  </pic:blipFill>
+                  <pic:spPr>
+                    <a:xfrm>
+                      <a:off x="0" y="0"/>
+                      <a:ext cx="5760000" cy="3481519"/>
+                    </a:xfrm>
+                    <a:prstGeom prst="rect"/>
+                  </pic:spPr>
+                </pic:pic>
+              </a:graphicData>
+            </a:graphic>
+          </wp:inline>
+        </w:drawing>
+      </w:r>
+    </w:p>
+    <w:p>
+      <w:pPr>
+        <w:spacing w:after="200"/>
+        <w:jc w:val="center"/>
+      </w:pPr>
+      <w:r>
+        <w:rPr>
+          <w:rFonts w:ascii="Times New Roman" w:hAnsi="Times New Roman"/>
+          <w:b w:val="0"/>
+          <w:i w:val="0"/>
+          <w:u w:val="none"/>
+        </w:rPr>
+        <w:t>Рис. А.2 – Послідовний термінал Wokwi після запуску: SELFTEST RESULT pass=8 fail=0, результати перевірок MPU-6050, W25Q64, ADC, кнопки і PWM, аномалії i2c_probe 0x69 NACK та spi_mode=3 jedec=FFFFFF</w:t>
+      </w:r>
+    </w:p>
+    <w:p>
+      <w:pPr>
+        <w:keepNext/>
+        <w:spacing w:before="120"/>
+        <w:jc w:val="center"/>
+      </w:pPr>
+      <w:r>
+        <w:drawing>
+          <wp:inline xmlns:a="http://schemas.openxmlformats.org/drawingml/2006/main" xmlns:pic="http://schemas.openxmlformats.org/drawingml/2006/picture">
+            <wp:extent cx="5760000" cy="3090000"/>
+            <wp:docPr id="11" name="Picture 11"/>
             <wp:cNvGraphicFramePr>
               <a:graphicFrameLocks noChangeAspect="1"/>
             </wp:cNvGraphicFramePr>
@@ -9027,7 +9064,7 @@
                     <pic:cNvPicPr/>
                   </pic:nvPicPr>
                   <pic:blipFill>
-                    <a:blip r:embed="rId24"/>
+                    <a:blip r:embed="rId25"/>
                     <a:stretch>
                       <a:fillRect/>
                     </a:stretch>
@@ -9035,7 +9072,7 @@
                   <pic:spPr>
                     <a:xfrm>
                       <a:off x="0" y="0"/>
-                      <a:ext cx="5760000" cy="3235955"/>
+                      <a:ext cx="5760000" cy="3090000"/>
                     </a:xfrm>
                     <a:prstGeom prst="rect"/>
                   </pic:spPr>
@@ -9058,7 +9095,7 @@
           <w:i w:val="0"/>
           <w:u w:val="none"/>
         </w:rPr>
-        <w:t>Рис. А.2 – STM32CubeMX, Pinout view: I2C1 (PA9/PA10), SPI1 (PB3/PB4/PB5), USART2 (PA2/PA3), TIM3 CH1/CH2 (PA6/PA7), ADC1_IN0 (PA0), FLASH_CS (PB0), MARKER (PB1), LED (PA5), BUTTON (PC13)</w:t>
+        <w:t>Рис. А.3 – STM32CubeMX, Pinout view: I2C1 (PA9/PA10), SPI1 (PB3/PB4/PB5), USART2 (PA2/PA3), TIM3 CH1/CH2 (PA6/PA7), ADC1_IN0 (PA0), FLASH_CS (PB0), MARKER (PB1), LED (PA5), BUTTON (PC13)</w:t>
       </w:r>
     </w:p>
     <w:p>
@@ -9070,8 +9107,8 @@
       <w:r>
         <w:drawing>
           <wp:inline xmlns:a="http://schemas.openxmlformats.org/drawingml/2006/main" xmlns:pic="http://schemas.openxmlformats.org/drawingml/2006/picture">
-            <wp:extent cx="5760000" cy="3235955"/>
-            <wp:docPr id="11" name="Picture 11"/>
+            <wp:extent cx="5760000" cy="3090000"/>
+            <wp:docPr id="12" name="Picture 12"/>
             <wp:cNvGraphicFramePr>
               <a:graphicFrameLocks noChangeAspect="1"/>
             </wp:cNvGraphicFramePr>
@@ -9083,7 +9120,7 @@
                     <pic:cNvPicPr/>
                   </pic:nvPicPr>
                   <pic:blipFill>
-                    <a:blip r:embed="rId25"/>
+                    <a:blip r:embed="rId26"/>
                     <a:stretch>
                       <a:fillRect/>
                     </a:stretch>
@@ -9091,7 +9128,7 @@
                   <pic:spPr>
                     <a:xfrm>
                       <a:off x="0" y="0"/>
-                      <a:ext cx="5760000" cy="3235955"/>
+                      <a:ext cx="5760000" cy="3090000"/>
                     </a:xfrm>
                     <a:prstGeom prst="rect"/>
                   </pic:spPr>
@@ -9114,7 +9151,7 @@
           <w:i w:val="0"/>
           <w:u w:val="none"/>
         </w:rPr>
-        <w:t>Рис. А.3 – STM32CubeMX, Clock Configuration: HSI48 → SYSCLK = HCLK = 48 МГц, APB = 48 МГц</w:t>
+        <w:t>Рис. А.4 – STM32CubeMX, Clock Configuration: HSI48 → SYSCLK = HCLK = 48 МГц, APB = 48 МГц, джерело тактування I2C1 – PCLK</w:t>
       </w:r>
     </w:p>
     <w:p>
@@ -9126,8 +9163,8 @@
       <w:r>
         <w:drawing>
           <wp:inline xmlns:a="http://schemas.openxmlformats.org/drawingml/2006/main" xmlns:pic="http://schemas.openxmlformats.org/drawingml/2006/picture">
-            <wp:extent cx="5760000" cy="2605025"/>
-            <wp:docPr id="12" name="Picture 12"/>
+            <wp:extent cx="5760000" cy="3090000"/>
+            <wp:docPr id="13" name="Picture 13"/>
             <wp:cNvGraphicFramePr>
               <a:graphicFrameLocks noChangeAspect="1"/>
             </wp:cNvGraphicFramePr>
@@ -9135,11 +9172,11 @@
               <a:graphicData uri="http://schemas.openxmlformats.org/drawingml/2006/picture">
                 <pic:pic>
                   <pic:nvPicPr>
-                    <pic:cNvPr id="0" name="wokwi_selftest.png"/>
+                    <pic:cNvPr id="0" name="cubemx_i2c1.png"/>
                     <pic:cNvPicPr/>
                   </pic:nvPicPr>
                   <pic:blipFill>
-                    <a:blip r:embed="rId26"/>
+                    <a:blip r:embed="rId27"/>
                     <a:stretch>
                       <a:fillRect/>
                     </a:stretch>
@@ -9147,7 +9184,7 @@
                   <pic:spPr>
                     <a:xfrm>
                       <a:off x="0" y="0"/>
-                      <a:ext cx="5760000" cy="2605025"/>
+                      <a:ext cx="5760000" cy="3090000"/>
                     </a:xfrm>
                     <a:prstGeom prst="rect"/>
                   </pic:spPr>
@@ -9170,7 +9207,7 @@
           <w:i w:val="0"/>
           <w:u w:val="none"/>
         </w:rPr>
-        <w:t>Рис. А.4 – Самоперевірка в Wokwi: послідовний термінал, SELFTEST RESULT pass=8 fail=0, результати DEV-перевірок MPU-6050, W25Q64, ADC, кнопки і PWM, аномалії i2c_probe 0x69 NACK та spi_mode=3 jedec=FFFFFF</w:t>
+        <w:t>Рис. А.5 – STM32CubeMX, параметри I2C1: Standard Mode 100 кГц, Timing 0x10805D88, 7-бітна адресація</w:t>
       </w:r>
     </w:p>
     <w:p>
@@ -9182,8 +9219,64 @@
       <w:r>
         <w:drawing>
           <wp:inline xmlns:a="http://schemas.openxmlformats.org/drawingml/2006/main" xmlns:pic="http://schemas.openxmlformats.org/drawingml/2006/picture">
-            <wp:extent cx="5760000" cy="3037560"/>
-            <wp:docPr id="13" name="Picture 13"/>
+            <wp:extent cx="5760000" cy="3090000"/>
+            <wp:docPr id="14" name="Picture 14"/>
+            <wp:cNvGraphicFramePr>
+              <a:graphicFrameLocks noChangeAspect="1"/>
+            </wp:cNvGraphicFramePr>
+            <a:graphic>
+              <a:graphicData uri="http://schemas.openxmlformats.org/drawingml/2006/picture">
+                <pic:pic>
+                  <pic:nvPicPr>
+                    <pic:cNvPr id="0" name="cubemx_spi1.png"/>
+                    <pic:cNvPicPr/>
+                  </pic:nvPicPr>
+                  <pic:blipFill>
+                    <a:blip r:embed="rId28"/>
+                    <a:stretch>
+                      <a:fillRect/>
+                    </a:stretch>
+                  </pic:blipFill>
+                  <pic:spPr>
+                    <a:xfrm>
+                      <a:off x="0" y="0"/>
+                      <a:ext cx="5760000" cy="3090000"/>
+                    </a:xfrm>
+                    <a:prstGeom prst="rect"/>
+                  </pic:spPr>
+                </pic:pic>
+              </a:graphicData>
+            </a:graphic>
+          </wp:inline>
+        </w:drawing>
+      </w:r>
+    </w:p>
+    <w:p>
+      <w:pPr>
+        <w:spacing w:after="200"/>
+        <w:jc w:val="center"/>
+      </w:pPr>
+      <w:r>
+        <w:rPr>
+          <w:rFonts w:ascii="Times New Roman" w:hAnsi="Times New Roman"/>
+          <w:b w:val="0"/>
+          <w:i w:val="0"/>
+          <w:u w:val="none"/>
+        </w:rPr>
+        <w:t>Рис. А.6 – STM32CubeMX, параметри SPI1: Full-Duplex Master, 8 біт, MSB first, CPOL Low, CPHA 1 Edge (режим 0), 3.0 Мбіт/с, програмний NSS</w:t>
+      </w:r>
+    </w:p>
+    <w:p>
+      <w:pPr>
+        <w:keepNext/>
+        <w:spacing w:before="120"/>
+        <w:jc w:val="center"/>
+      </w:pPr>
+      <w:r>
+        <w:drawing>
+          <wp:inline xmlns:a="http://schemas.openxmlformats.org/drawingml/2006/main" xmlns:pic="http://schemas.openxmlformats.org/drawingml/2006/picture">
+            <wp:extent cx="5760000" cy="5524645"/>
+            <wp:docPr id="15" name="Picture 15"/>
             <wp:cNvGraphicFramePr>
               <a:graphicFrameLocks noChangeAspect="1"/>
             </wp:cNvGraphicFramePr>
@@ -9195,7 +9288,7 @@
                     <pic:cNvPicPr/>
                   </pic:nvPicPr>
                   <pic:blipFill>
-                    <a:blip r:embed="rId27"/>
+                    <a:blip r:embed="rId29"/>
                     <a:stretch>
                       <a:fillRect/>
                     </a:stretch>
@@ -9203,7 +9296,7 @@
                   <pic:spPr>
                     <a:xfrm>
                       <a:off x="0" y="0"/>
-                      <a:ext cx="5760000" cy="3037560"/>
+                      <a:ext cx="5760000" cy="5524645"/>
                     </a:xfrm>
                     <a:prstGeom prst="rect"/>
                   </pic:spPr>
@@ -9226,7 +9319,7 @@
           <w:i w:val="0"/>
           <w:u w:val="none"/>
         </w:rPr>
-        <w:t>Рис. А.5 – make build: збірка з прапорами -Wextra -Wshadow -Wpedantic -Werror, розмір прошивки text = 26568 байт</w:t>
+        <w:t>Рис. А.7 – make build: збірка шарів Platform/Devices/App з прапорами -Wextra -Wshadow -Wpedantic -Werror, компонування і розмір прошивки (text = 26568 байт)</w:t>
       </w:r>
     </w:p>
     <w:p>
@@ -9238,8 +9331,8 @@
       <w:r>
         <w:drawing>
           <wp:inline xmlns:a="http://schemas.openxmlformats.org/drawingml/2006/main" xmlns:pic="http://schemas.openxmlformats.org/drawingml/2006/picture">
-            <wp:extent cx="5760000" cy="3037560"/>
-            <wp:docPr id="14" name="Picture 14"/>
+            <wp:extent cx="4836233" cy="7559999"/>
+            <wp:docPr id="16" name="Picture 16"/>
             <wp:cNvGraphicFramePr>
               <a:graphicFrameLocks noChangeAspect="1"/>
             </wp:cNvGraphicFramePr>
@@ -9251,7 +9344,7 @@
                     <pic:cNvPicPr/>
                   </pic:nvPicPr>
                   <pic:blipFill>
-                    <a:blip r:embed="rId28"/>
+                    <a:blip r:embed="rId30"/>
                     <a:stretch>
                       <a:fillRect/>
                     </a:stretch>
@@ -9259,7 +9352,7 @@
                   <pic:spPr>
                     <a:xfrm>
                       <a:off x="0" y="0"/>
-                      <a:ext cx="5760000" cy="3037560"/>
+                      <a:ext cx="4836233" cy="7559999"/>
                     </a:xfrm>
                     <a:prstGeom prst="rect"/>
                   </pic:spPr>
@@ -9282,7 +9375,7 @@
           <w:i w:val="0"/>
           <w:u w:val="none"/>
         </w:rPr>
-        <w:t>Рис. А.6 – make test: усі 69 перевірок пройдено, PASSED: 0 test(s) failed</w:t>
+        <w:t>Рис. А.8 – make test: усі 69 перевірок чотирьох наборів пройдено, PASSED: 0 test(s) failed</w:t>
       </w:r>
     </w:p>
     <w:p>
@@ -9294,8 +9387,8 @@
       <w:r>
         <w:drawing>
           <wp:inline xmlns:a="http://schemas.openxmlformats.org/drawingml/2006/main" xmlns:pic="http://schemas.openxmlformats.org/drawingml/2006/picture">
-            <wp:extent cx="5760000" cy="3037560"/>
-            <wp:docPr id="15" name="Picture 15"/>
+            <wp:extent cx="5760000" cy="4206316"/>
+            <wp:docPr id="17" name="Picture 17"/>
             <wp:cNvGraphicFramePr>
               <a:graphicFrameLocks noChangeAspect="1"/>
             </wp:cNvGraphicFramePr>
@@ -9307,7 +9400,7 @@
                     <pic:cNvPicPr/>
                   </pic:nvPicPr>
                   <pic:blipFill>
-                    <a:blip r:embed="rId29"/>
+                    <a:blip r:embed="rId31"/>
                     <a:stretch>
                       <a:fillRect/>
                     </a:stretch>
@@ -9315,7 +9408,7 @@
                   <pic:spPr>
                     <a:xfrm>
                       <a:off x="0" y="0"/>
-                      <a:ext cx="5760000" cy="3037560"/>
+                      <a:ext cx="5760000" cy="4206316"/>
                     </a:xfrm>
                     <a:prstGeom prst="rect"/>
                   </pic:spPr>
@@ -9338,7 +9431,7 @@
           <w:i w:val="0"/>
           <w:u w:val="none"/>
         </w:rPr>
-        <w:t>Рис. А.7 – make coverage: покриття 95.4 % рядків і 77.9 % гілок, пороги 90 % / 70 % виконано</w:t>
+        <w:t>Рис. А.9 – make coverage: покриття 95.4 % рядків і 77.9 % гілок, пороги 90 % і 70 % виконано; таблиця покриття по файлах (рядки з результатами тестів у цьому знімку приховано)</w:t>
       </w:r>
     </w:p>
     <w:p>
@@ -9350,8 +9443,8 @@
       <w:r>
         <w:drawing>
           <wp:inline xmlns:a="http://schemas.openxmlformats.org/drawingml/2006/main" xmlns:pic="http://schemas.openxmlformats.org/drawingml/2006/picture">
-            <wp:extent cx="5760000" cy="3037560"/>
-            <wp:docPr id="16" name="Picture 16"/>
+            <wp:extent cx="5760000" cy="1810286"/>
+            <wp:docPr id="18" name="Picture 18"/>
             <wp:cNvGraphicFramePr>
               <a:graphicFrameLocks noChangeAspect="1"/>
             </wp:cNvGraphicFramePr>
@@ -9363,7 +9456,7 @@
                     <pic:cNvPicPr/>
                   </pic:nvPicPr>
                   <pic:blipFill>
-                    <a:blip r:embed="rId30"/>
+                    <a:blip r:embed="rId32"/>
                     <a:stretch>
                       <a:fillRect/>
                     </a:stretch>
@@ -9371,7 +9464,7 @@
                   <pic:spPr>
                     <a:xfrm>
                       <a:off x="0" y="0"/>
-                      <a:ext cx="5760000" cy="3037560"/>
+                      <a:ext cx="5760000" cy="1810286"/>
                     </a:xfrm>
                     <a:prstGeom prst="rect"/>
                   </pic:spPr>
@@ -9394,7 +9487,7 @@
           <w:i w:val="0"/>
           <w:u w:val="none"/>
         </w:rPr>
-        <w:t>Рис. А.8 – make check: правила залежностей шарів, самоперевірка перевірки (2 навмисні порушення виявлено), check-pinout: 14 rows, 0 errors; історія комітів гілки lab2</w:t>
+        <w:t>Рис. А.10 – Перевірки: правила залежностей шарів, самоперевірка перевірки (2 навмисні порушення виявлено), check-pinout (14 рядків, 0 помилок) та історія комітів гілки lab2</w:t>
       </w:r>
     </w:p>
     <w:p>
@@ -9406,8 +9499,8 @@
       <w:r>
         <w:drawing>
           <wp:inline xmlns:a="http://schemas.openxmlformats.org/drawingml/2006/main" xmlns:pic="http://schemas.openxmlformats.org/drawingml/2006/picture">
-            <wp:extent cx="5760000" cy="2159354"/>
-            <wp:docPr id="17" name="Picture 17"/>
+            <wp:extent cx="5760000" cy="3276000"/>
+            <wp:docPr id="19" name="Picture 19"/>
             <wp:cNvGraphicFramePr>
               <a:graphicFrameLocks noChangeAspect="1"/>
             </wp:cNvGraphicFramePr>
@@ -9419,7 +9512,7 @@
                     <pic:cNvPicPr/>
                   </pic:nvPicPr>
                   <pic:blipFill>
-                    <a:blip r:embed="rId31"/>
+                    <a:blip r:embed="rId33"/>
                     <a:stretch>
                       <a:fillRect/>
                     </a:stretch>
@@ -9427,7 +9520,7 @@
                   <pic:spPr>
                     <a:xfrm>
                       <a:off x="0" y="0"/>
-                      <a:ext cx="5760000" cy="2159354"/>
+                      <a:ext cx="5760000" cy="3276000"/>
                     </a:xfrm>
                     <a:prstGeom prst="rect"/>
                   </pic:spPr>
@@ -9450,7 +9543,7 @@
           <w:i w:val="0"/>
           <w:u w:val="none"/>
         </w:rPr>
-        <w:t>Рис. А.9 – Декодування записів логічного аналізатора через sigrok-cli: I2C (WHO_AM_I, адреса 0x68) і SPI (JEDEC ID: 0xEF, 0x40, 0x17)</w:t>
+        <w:t>Рис. А.11 – Декодування записів логічного аналізатора через sigrok-cli: I2C WHO_AM_I (адреса 0x68, дані 0x68), SPI JEDEC ID (0xEF, 0x40, 0x17) та аномалія – адреса 0x69, NACK</w:t>
       </w:r>
     </w:p>
     <w:p>
@@ -9694,7 +9787,7 @@
       </w:r>
     </w:p>
     <w:sectPr>
-      <w:footerReference w:type="default" r:id="rId32"/>
+      <w:footerReference w:type="default" r:id="rId34"/>
       <w:pgSz w:w="11906" w:h="16838"/>
       <w:pgMar w:top="1134" w:right="850" w:bottom="1134" w:left="1417" w:header="720" w:footer="720" w:gutter="0"/>
       <w:cols w:space="720"/>

</xml_diff>

<commit_message>
Report: add PulseView screenshots with protocol decoders (I2C, SPI, UART, PWM)
</commit_message>
<xml_diff>
--- a/docs/LR2_report.docx
+++ b/docs/LR2_report.docx
@@ -2763,74 +2763,6 @@
     </w:p>
     <w:p>
       <w:pPr>
-        <w:spacing w:after="120"/>
-        <w:jc w:val="both"/>
-      </w:pPr>
-      <w:r>
-        <w:rPr>
-          <w:rFonts w:ascii="Times New Roman" w:hAnsi="Times New Roman"/>
-          <w:b w:val="0"/>
-          <w:i w:val="0"/>
-          <w:u w:val="none"/>
-        </w:rPr>
-        <w:t xml:space="preserve">Декодування sigrok: </w:t>
-      </w:r>
-      <w:r>
-        <w:rPr>
-          <w:rFonts w:ascii="Courier New" w:hAnsi="Courier New" w:eastAsia="Courier New"/>
-          <w:b w:val="0"/>
-          <w:i w:val="0"/>
-          <w:sz w:val="24"/>
-          <w:u w:val="none"/>
-        </w:rPr>
-        <w:t>Start, Address write 68 ACK, Data write 75 ACK, Stop, Start, Address read 68 ACK, Data read 68 NACK, Stop</w:t>
-      </w:r>
-      <w:r>
-        <w:rPr>
-          <w:rFonts w:ascii="Times New Roman" w:hAnsi="Times New Roman"/>
-          <w:b w:val="0"/>
-          <w:i w:val="0"/>
-          <w:u w:val="none"/>
-        </w:rPr>
-        <w:t>. Значення WHO_AM_I = 0x68 збігається з Register Map. Виміряно: період SCL 10.00 мкс (100.0 кГц), ширина високого рівня 5.00 мкс, запис регістра (START→STOP) 197.25 мкс, пакетне читання 14 байтів 1365 мкс. Розрахунок за TIMINGR 0x10805D88: tSCLL = 5.71 мкс, tSCLH = 3.92 мкс, період ≈ 9.63 мкс + фронти → збіг у межах 4 %.</w:t>
-      </w:r>
-    </w:p>
-    <w:p>
-      <w:pPr>
-        <w:spacing w:after="120"/>
-        <w:jc w:val="both"/>
-      </w:pPr>
-      <w:r>
-        <w:rPr>
-          <w:rFonts w:ascii="Times New Roman" w:hAnsi="Times New Roman"/>
-          <w:b w:val="0"/>
-          <w:i w:val="0"/>
-          <w:u w:val="none"/>
-        </w:rPr>
-        <w:t xml:space="preserve">Ручне декодування байта: SDA у моменти дев'яти наростаючих фронтів SCL = </w:t>
-      </w:r>
-      <w:r>
-        <w:rPr>
-          <w:rFonts w:ascii="Courier New" w:hAnsi="Courier New" w:eastAsia="Courier New"/>
-          <w:b w:val="0"/>
-          <w:i w:val="0"/>
-          <w:sz w:val="24"/>
-          <w:u w:val="none"/>
-        </w:rPr>
-        <w:t>1 1 0 1 0 0 0 0 | 0</w:t>
-      </w:r>
-      <w:r>
-        <w:rPr>
-          <w:rFonts w:ascii="Times New Roman" w:hAnsi="Times New Roman"/>
-          <w:b w:val="0"/>
-          <w:i w:val="0"/>
-          <w:u w:val="none"/>
-        </w:rPr>
-        <w:t xml:space="preserve"> → 0xD0 = (0x68 &lt;&lt; 1) | 0 (запис), дев'ятий біт 0 – ACK.</w:t>
-      </w:r>
-    </w:p>
-    <w:p>
-      <w:pPr>
         <w:keepNext/>
         <w:spacing w:before="120"/>
         <w:jc w:val="center"/>
@@ -2838,7 +2770,7 @@
       <w:r>
         <w:drawing>
           <wp:inline xmlns:a="http://schemas.openxmlformats.org/drawingml/2006/main" xmlns:pic="http://schemas.openxmlformats.org/drawingml/2006/picture">
-            <wp:extent cx="5760000" cy="1284923"/>
+            <wp:extent cx="5760000" cy="810000"/>
             <wp:docPr id="2" name="Picture 2"/>
             <wp:cNvGraphicFramePr>
               <a:graphicFrameLocks noChangeAspect="1"/>
@@ -2847,7 +2779,7 @@
               <a:graphicData uri="http://schemas.openxmlformats.org/drawingml/2006/picture">
                 <pic:pic>
                   <pic:nvPicPr>
-                    <pic:cNvPr id="0" name="i2c_init.png"/>
+                    <pic:cNvPr id="0" name="pulseview_i2c_whoami.png"/>
                     <pic:cNvPicPr/>
                   </pic:nvPicPr>
                   <pic:blipFill>
@@ -2859,7 +2791,7 @@
                   <pic:spPr>
                     <a:xfrm>
                       <a:off x="0" y="0"/>
-                      <a:ext cx="5760000" cy="1284923"/>
+                      <a:ext cx="5760000" cy="810000"/>
                     </a:xfrm>
                     <a:prstGeom prst="rect"/>
                   </pic:spPr>
@@ -2882,7 +2814,7 @@
           <w:i w:val="0"/>
           <w:u w:val="none"/>
         </w:rPr>
-        <w:t>Рис. 2. Ініціалізація MPU-6050</w:t>
+        <w:t>Рис. 1а. PulseView, декодер I²C (SCL = D0, SDA = D1): `S`, `Address write: 68`, `W`, `A`, `Data write: 75`, `A`, `P`, `S`, `Address read: 68`, `R`, `A`, `Data read: 68`, `N`, `P`</w:t>
       </w:r>
     </w:p>
     <w:p>
@@ -2897,7 +2829,7 @@
           <w:i w:val="0"/>
           <w:u w:val="none"/>
         </w:rPr>
-        <w:t xml:space="preserve">Ініціалізація: PWR_MGMT_1 ← 0x01, SMPLRT_DIV ← 0x13 (50 Гц), CONFIG ← 0x03 (DLPF 44 Гц), GYRO_CONFIG ← 0x00 (±250 °/с), ACCEL_CONFIG ← 0x00 (±2 g). Пакетне читання (14 байтів від 0x3B): </w:t>
+        <w:t xml:space="preserve">Декодування sigrok: </w:t>
       </w:r>
       <w:r>
         <w:rPr>
@@ -2907,16 +2839,50 @@
           <w:sz w:val="24"/>
           <w:u w:val="none"/>
         </w:rPr>
-        <w:t>00 00 00 00 40 00 EF 5C 00 …</w:t>
-      </w:r>
-      <w:r>
-        <w:rPr>
-          <w:rFonts w:ascii="Times New Roman" w:hAnsi="Times New Roman"/>
-          <w:b w:val="0"/>
-          <w:i w:val="0"/>
-          <w:u w:val="none"/>
-        </w:rPr>
-        <w:t xml:space="preserve"> → az = 16384 LSB = 1 g, температура 24.0 °C за формулою Register Map.</w:t>
+        <w:t>Start, Address write 68 ACK, Data write 75 ACK, Stop, Start, Address read 68 ACK, Data read 68 NACK, Stop</w:t>
+      </w:r>
+      <w:r>
+        <w:rPr>
+          <w:rFonts w:ascii="Times New Roman" w:hAnsi="Times New Roman"/>
+          <w:b w:val="0"/>
+          <w:i w:val="0"/>
+          <w:u w:val="none"/>
+        </w:rPr>
+        <w:t>. Значення WHO_AM_I = 0x68 збігається з Register Map. Виміряно: період SCL 10.00 мкс (100.0 кГц), ширина високого рівня 5.00 мкс, запис регістра (START→STOP) 197.25 мкс, пакетне читання 14 байтів 1365 мкс. Розрахунок за TIMINGR 0x10805D88: tSCLL = 5.71 мкс, tSCLH = 3.92 мкс, період ≈ 9.63 мкс + фронти → збіг у межах 4 %.</w:t>
+      </w:r>
+    </w:p>
+    <w:p>
+      <w:pPr>
+        <w:spacing w:after="120"/>
+        <w:jc w:val="both"/>
+      </w:pPr>
+      <w:r>
+        <w:rPr>
+          <w:rFonts w:ascii="Times New Roman" w:hAnsi="Times New Roman"/>
+          <w:b w:val="0"/>
+          <w:i w:val="0"/>
+          <w:u w:val="none"/>
+        </w:rPr>
+        <w:t xml:space="preserve">Ручне декодування байта: SDA у моменти дев'яти наростаючих фронтів SCL = </w:t>
+      </w:r>
+      <w:r>
+        <w:rPr>
+          <w:rFonts w:ascii="Courier New" w:hAnsi="Courier New" w:eastAsia="Courier New"/>
+          <w:b w:val="0"/>
+          <w:i w:val="0"/>
+          <w:sz w:val="24"/>
+          <w:u w:val="none"/>
+        </w:rPr>
+        <w:t>1 1 0 1 0 0 0 0 | 0</w:t>
+      </w:r>
+      <w:r>
+        <w:rPr>
+          <w:rFonts w:ascii="Times New Roman" w:hAnsi="Times New Roman"/>
+          <w:b w:val="0"/>
+          <w:i w:val="0"/>
+          <w:u w:val="none"/>
+        </w:rPr>
+        <w:t xml:space="preserve"> → 0xD0 = (0x68 &lt;&lt; 1) | 0 (запис), дев'ятий біт 0 – ACK.</w:t>
       </w:r>
     </w:p>
     <w:p>
@@ -2937,7 +2903,7 @@
               <a:graphicData uri="http://schemas.openxmlformats.org/drawingml/2006/picture">
                 <pic:pic>
                   <pic:nvPicPr>
-                    <pic:cNvPr id="0" name="i2c_nack.png"/>
+                    <pic:cNvPr id="0" name="i2c_init.png"/>
                     <pic:cNvPicPr/>
                   </pic:nvPicPr>
                   <pic:blipFill>
@@ -2972,7 +2938,265 @@
           <w:i w:val="0"/>
           <w:u w:val="none"/>
         </w:rPr>
+        <w:t>Рис. 2. Ініціалізація MPU-6050</w:t>
+      </w:r>
+    </w:p>
+    <w:p>
+      <w:pPr>
+        <w:keepNext/>
+        <w:spacing w:before="120"/>
+        <w:jc w:val="center"/>
+      </w:pPr>
+      <w:r>
+        <w:drawing>
+          <wp:inline xmlns:a="http://schemas.openxmlformats.org/drawingml/2006/main" xmlns:pic="http://schemas.openxmlformats.org/drawingml/2006/picture">
+            <wp:extent cx="5760000" cy="810000"/>
+            <wp:docPr id="4" name="Picture 4"/>
+            <wp:cNvGraphicFramePr>
+              <a:graphicFrameLocks noChangeAspect="1"/>
+            </wp:cNvGraphicFramePr>
+            <a:graphic>
+              <a:graphicData uri="http://schemas.openxmlformats.org/drawingml/2006/picture">
+                <pic:pic>
+                  <pic:nvPicPr>
+                    <pic:cNvPr id="0" name="pulseview_i2c_init.png"/>
+                    <pic:cNvPicPr/>
+                  </pic:nvPicPr>
+                  <pic:blipFill>
+                    <a:blip r:embed="rId12"/>
+                    <a:stretch>
+                      <a:fillRect/>
+                    </a:stretch>
+                  </pic:blipFill>
+                  <pic:spPr>
+                    <a:xfrm>
+                      <a:off x="0" y="0"/>
+                      <a:ext cx="5760000" cy="810000"/>
+                    </a:xfrm>
+                    <a:prstGeom prst="rect"/>
+                  </pic:spPr>
+                </pic:pic>
+              </a:graphicData>
+            </a:graphic>
+          </wp:inline>
+        </w:drawing>
+      </w:r>
+    </w:p>
+    <w:p>
+      <w:pPr>
+        <w:spacing w:after="200"/>
+        <w:jc w:val="center"/>
+      </w:pPr>
+      <w:r>
+        <w:rPr>
+          <w:rFonts w:ascii="Times New Roman" w:hAnsi="Times New Roman"/>
+          <w:b w:val="0"/>
+          <w:i w:val="0"/>
+          <w:u w:val="none"/>
+        </w:rPr>
+        <w:t>Рис. 2а. PulseView: п'ять записів у регістри MPU-6050 (AW 68, DW 6B 01 / 19 13 / 1A 03 / 1B 00 / 1C 00), перед ними перевірка WHO_AM_I</w:t>
+      </w:r>
+    </w:p>
+    <w:p>
+      <w:pPr>
+        <w:keepNext/>
+        <w:spacing w:before="120"/>
+        <w:jc w:val="center"/>
+      </w:pPr>
+      <w:r>
+        <w:drawing>
+          <wp:inline xmlns:a="http://schemas.openxmlformats.org/drawingml/2006/main" xmlns:pic="http://schemas.openxmlformats.org/drawingml/2006/picture">
+            <wp:extent cx="5760000" cy="810000"/>
+            <wp:docPr id="5" name="Picture 5"/>
+            <wp:cNvGraphicFramePr>
+              <a:graphicFrameLocks noChangeAspect="1"/>
+            </wp:cNvGraphicFramePr>
+            <a:graphic>
+              <a:graphicData uri="http://schemas.openxmlformats.org/drawingml/2006/picture">
+                <pic:pic>
+                  <pic:nvPicPr>
+                    <pic:cNvPr id="0" name="pulseview_i2c_burst.png"/>
+                    <pic:cNvPicPr/>
+                  </pic:nvPicPr>
+                  <pic:blipFill>
+                    <a:blip r:embed="rId13"/>
+                    <a:stretch>
+                      <a:fillRect/>
+                    </a:stretch>
+                  </pic:blipFill>
+                  <pic:spPr>
+                    <a:xfrm>
+                      <a:off x="0" y="0"/>
+                      <a:ext cx="5760000" cy="810000"/>
+                    </a:xfrm>
+                    <a:prstGeom prst="rect"/>
+                  </pic:spPr>
+                </pic:pic>
+              </a:graphicData>
+            </a:graphic>
+          </wp:inline>
+        </w:drawing>
+      </w:r>
+    </w:p>
+    <w:p>
+      <w:pPr>
+        <w:spacing w:after="200"/>
+        <w:jc w:val="center"/>
+      </w:pPr>
+      <w:r>
+        <w:rPr>
+          <w:rFonts w:ascii="Times New Roman" w:hAnsi="Times New Roman"/>
+          <w:b w:val="0"/>
+          <w:i w:val="0"/>
+          <w:u w:val="none"/>
+        </w:rPr>
+        <w:t>Рис. 2б. PulseView: пакетне читання 14 байтів від регістра 0x3B (DW 3B, потім AR 68 і 14 байтів даних, останній – NACK)</w:t>
+      </w:r>
+    </w:p>
+    <w:p>
+      <w:pPr>
+        <w:spacing w:after="120"/>
+        <w:jc w:val="both"/>
+      </w:pPr>
+      <w:r>
+        <w:rPr>
+          <w:rFonts w:ascii="Times New Roman" w:hAnsi="Times New Roman"/>
+          <w:b w:val="0"/>
+          <w:i w:val="0"/>
+          <w:u w:val="none"/>
+        </w:rPr>
+        <w:t xml:space="preserve">Ініціалізація: PWR_MGMT_1 ← 0x01, SMPLRT_DIV ← 0x13 (50 Гц), CONFIG ← 0x03 (DLPF 44 Гц), GYRO_CONFIG ← 0x00 (±250 °/с), ACCEL_CONFIG ← 0x00 (±2 g). Пакетне читання (14 байтів від 0x3B): </w:t>
+      </w:r>
+      <w:r>
+        <w:rPr>
+          <w:rFonts w:ascii="Courier New" w:hAnsi="Courier New" w:eastAsia="Courier New"/>
+          <w:b w:val="0"/>
+          <w:i w:val="0"/>
+          <w:sz w:val="24"/>
+          <w:u w:val="none"/>
+        </w:rPr>
+        <w:t>00 00 00 00 40 00 EF 5C 00 …</w:t>
+      </w:r>
+      <w:r>
+        <w:rPr>
+          <w:rFonts w:ascii="Times New Roman" w:hAnsi="Times New Roman"/>
+          <w:b w:val="0"/>
+          <w:i w:val="0"/>
+          <w:u w:val="none"/>
+        </w:rPr>
+        <w:t xml:space="preserve"> → az = 16384 LSB = 1 g, температура 24.0 °C за формулою Register Map.</w:t>
+      </w:r>
+    </w:p>
+    <w:p>
+      <w:pPr>
+        <w:keepNext/>
+        <w:spacing w:before="120"/>
+        <w:jc w:val="center"/>
+      </w:pPr>
+      <w:r>
+        <w:drawing>
+          <wp:inline xmlns:a="http://schemas.openxmlformats.org/drawingml/2006/main" xmlns:pic="http://schemas.openxmlformats.org/drawingml/2006/picture">
+            <wp:extent cx="5760000" cy="1284923"/>
+            <wp:docPr id="6" name="Picture 6"/>
+            <wp:cNvGraphicFramePr>
+              <a:graphicFrameLocks noChangeAspect="1"/>
+            </wp:cNvGraphicFramePr>
+            <a:graphic>
+              <a:graphicData uri="http://schemas.openxmlformats.org/drawingml/2006/picture">
+                <pic:pic>
+                  <pic:nvPicPr>
+                    <pic:cNvPr id="0" name="i2c_nack.png"/>
+                    <pic:cNvPicPr/>
+                  </pic:nvPicPr>
+                  <pic:blipFill>
+                    <a:blip r:embed="rId14"/>
+                    <a:stretch>
+                      <a:fillRect/>
+                    </a:stretch>
+                  </pic:blipFill>
+                  <pic:spPr>
+                    <a:xfrm>
+                      <a:off x="0" y="0"/>
+                      <a:ext cx="5760000" cy="1284923"/>
+                    </a:xfrm>
+                    <a:prstGeom prst="rect"/>
+                  </pic:spPr>
+                </pic:pic>
+              </a:graphicData>
+            </a:graphic>
+          </wp:inline>
+        </w:drawing>
+      </w:r>
+    </w:p>
+    <w:p>
+      <w:pPr>
+        <w:spacing w:after="200"/>
+        <w:jc w:val="center"/>
+      </w:pPr>
+      <w:r>
+        <w:rPr>
+          <w:rFonts w:ascii="Times New Roman" w:hAnsi="Times New Roman"/>
+          <w:b w:val="0"/>
+          <w:i w:val="0"/>
+          <w:u w:val="none"/>
+        </w:rPr>
         <w:t>Рис. 3. Аномалія: адреса 0x69 – NACK</w:t>
+      </w:r>
+    </w:p>
+    <w:p>
+      <w:pPr>
+        <w:keepNext/>
+        <w:spacing w:before="120"/>
+        <w:jc w:val="center"/>
+      </w:pPr>
+      <w:r>
+        <w:drawing>
+          <wp:inline xmlns:a="http://schemas.openxmlformats.org/drawingml/2006/main" xmlns:pic="http://schemas.openxmlformats.org/drawingml/2006/picture">
+            <wp:extent cx="5760000" cy="810000"/>
+            <wp:docPr id="7" name="Picture 7"/>
+            <wp:cNvGraphicFramePr>
+              <a:graphicFrameLocks noChangeAspect="1"/>
+            </wp:cNvGraphicFramePr>
+            <a:graphic>
+              <a:graphicData uri="http://schemas.openxmlformats.org/drawingml/2006/picture">
+                <pic:pic>
+                  <pic:nvPicPr>
+                    <pic:cNvPr id="0" name="pulseview_i2c_nack.png"/>
+                    <pic:cNvPicPr/>
+                  </pic:nvPicPr>
+                  <pic:blipFill>
+                    <a:blip r:embed="rId15"/>
+                    <a:stretch>
+                      <a:fillRect/>
+                    </a:stretch>
+                  </pic:blipFill>
+                  <pic:spPr>
+                    <a:xfrm>
+                      <a:off x="0" y="0"/>
+                      <a:ext cx="5760000" cy="810000"/>
+                    </a:xfrm>
+                    <a:prstGeom prst="rect"/>
+                  </pic:spPr>
+                </pic:pic>
+              </a:graphicData>
+            </a:graphic>
+          </wp:inline>
+        </w:drawing>
+      </w:r>
+    </w:p>
+    <w:p>
+      <w:pPr>
+        <w:spacing w:after="200"/>
+        <w:jc w:val="center"/>
+      </w:pPr>
+      <w:r>
+        <w:rPr>
+          <w:rFonts w:ascii="Times New Roman" w:hAnsi="Times New Roman"/>
+          <w:b w:val="0"/>
+          <w:i w:val="0"/>
+          <w:u w:val="none"/>
+        </w:rPr>
+        <w:t>Рис. 3а. PulseView: `Address write: 69` завершується `NACK`, далі `P` – пристрій з такою адресою відсутній</w:t>
       </w:r>
     </w:p>
     <w:p>
@@ -3073,7 +3297,7 @@
         <w:drawing>
           <wp:inline xmlns:a="http://schemas.openxmlformats.org/drawingml/2006/main" xmlns:pic="http://schemas.openxmlformats.org/drawingml/2006/picture">
             <wp:extent cx="5760000" cy="2126769"/>
-            <wp:docPr id="4" name="Picture 4"/>
+            <wp:docPr id="8" name="Picture 8"/>
             <wp:cNvGraphicFramePr>
               <a:graphicFrameLocks noChangeAspect="1"/>
             </wp:cNvGraphicFramePr>
@@ -3085,7 +3309,7 @@
                     <pic:cNvPicPr/>
                   </pic:nvPicPr>
                   <pic:blipFill>
-                    <a:blip r:embed="rId12"/>
+                    <a:blip r:embed="rId16"/>
                     <a:stretch>
                       <a:fillRect/>
                     </a:stretch>
@@ -3129,7 +3353,7 @@
         <w:drawing>
           <wp:inline xmlns:a="http://schemas.openxmlformats.org/drawingml/2006/main" xmlns:pic="http://schemas.openxmlformats.org/drawingml/2006/picture">
             <wp:extent cx="5760000" cy="2016000"/>
-            <wp:docPr id="5" name="Picture 5"/>
+            <wp:docPr id="9" name="Picture 9"/>
             <wp:cNvGraphicFramePr>
               <a:graphicFrameLocks noChangeAspect="1"/>
             </wp:cNvGraphicFramePr>
@@ -3141,7 +3365,7 @@
                     <pic:cNvPicPr/>
                   </pic:nvPicPr>
                   <pic:blipFill>
-                    <a:blip r:embed="rId13"/>
+                    <a:blip r:embed="rId17"/>
                     <a:stretch>
                       <a:fillRect/>
                     </a:stretch>
@@ -3177,6 +3401,174 @@
     </w:p>
     <w:p>
       <w:pPr>
+        <w:keepNext/>
+        <w:spacing w:before="120"/>
+        <w:jc w:val="center"/>
+      </w:pPr>
+      <w:r>
+        <w:drawing>
+          <wp:inline xmlns:a="http://schemas.openxmlformats.org/drawingml/2006/main" xmlns:pic="http://schemas.openxmlformats.org/drawingml/2006/picture">
+            <wp:extent cx="5760000" cy="1350000"/>
+            <wp:docPr id="10" name="Picture 10"/>
+            <wp:cNvGraphicFramePr>
+              <a:graphicFrameLocks noChangeAspect="1"/>
+            </wp:cNvGraphicFramePr>
+            <a:graphic>
+              <a:graphicData uri="http://schemas.openxmlformats.org/drawingml/2006/picture">
+                <pic:pic>
+                  <pic:nvPicPr>
+                    <pic:cNvPr id="0" name="pulseview_spi_jedec.png"/>
+                    <pic:cNvPicPr/>
+                  </pic:nvPicPr>
+                  <pic:blipFill>
+                    <a:blip r:embed="rId18"/>
+                    <a:stretch>
+                      <a:fillRect/>
+                    </a:stretch>
+                  </pic:blipFill>
+                  <pic:spPr>
+                    <a:xfrm>
+                      <a:off x="0" y="0"/>
+                      <a:ext cx="5760000" cy="1350000"/>
+                    </a:xfrm>
+                    <a:prstGeom prst="rect"/>
+                  </pic:spPr>
+                </pic:pic>
+              </a:graphicData>
+            </a:graphic>
+          </wp:inline>
+        </w:drawing>
+      </w:r>
+    </w:p>
+    <w:p>
+      <w:pPr>
+        <w:spacing w:after="200"/>
+        <w:jc w:val="center"/>
+      </w:pPr>
+      <w:r>
+        <w:rPr>
+          <w:rFonts w:ascii="Times New Roman" w:hAnsi="Times New Roman"/>
+          <w:b w:val="0"/>
+          <w:i w:val="0"/>
+          <w:u w:val="none"/>
+        </w:rPr>
+        <w:t>Рис. 4а. PulseView, декодери SPI (CLK = D2, MOSI = D3, MISO = D4, CS = D5) і SPI flash: MOSI `9F FF FF FF`, MISO `7F EF 40 17`, команда `Read identification (RDID)`. Назву виробника в підписі декодера (`Adesto`) PulseView бере з власної таблиці; ідентифікатор EF 40 17 відповідає Winbond W25Q64JV за datasheet</w:t>
+      </w:r>
+    </w:p>
+    <w:p>
+      <w:pPr>
+        <w:keepNext/>
+        <w:spacing w:before="120"/>
+        <w:jc w:val="center"/>
+      </w:pPr>
+      <w:r>
+        <w:drawing>
+          <wp:inline xmlns:a="http://schemas.openxmlformats.org/drawingml/2006/main" xmlns:pic="http://schemas.openxmlformats.org/drawingml/2006/picture">
+            <wp:extent cx="5760000" cy="1350000"/>
+            <wp:docPr id="11" name="Picture 11"/>
+            <wp:cNvGraphicFramePr>
+              <a:graphicFrameLocks noChangeAspect="1"/>
+            </wp:cNvGraphicFramePr>
+            <a:graphic>
+              <a:graphicData uri="http://schemas.openxmlformats.org/drawingml/2006/picture">
+                <pic:pic>
+                  <pic:nvPicPr>
+                    <pic:cNvPr id="0" name="pulseview_spi_program_read.png"/>
+                    <pic:cNvPicPr/>
+                  </pic:nvPicPr>
+                  <pic:blipFill>
+                    <a:blip r:embed="rId19"/>
+                    <a:stretch>
+                      <a:fillRect/>
+                    </a:stretch>
+                  </pic:blipFill>
+                  <pic:spPr>
+                    <a:xfrm>
+                      <a:off x="0" y="0"/>
+                      <a:ext cx="5760000" cy="1350000"/>
+                    </a:xfrm>
+                    <a:prstGeom prst="rect"/>
+                  </pic:spPr>
+                </pic:pic>
+              </a:graphicData>
+            </a:graphic>
+          </wp:inline>
+        </w:drawing>
+      </w:r>
+    </w:p>
+    <w:p>
+      <w:pPr>
+        <w:spacing w:after="200"/>
+        <w:jc w:val="center"/>
+      </w:pPr>
+      <w:r>
+        <w:rPr>
+          <w:rFonts w:ascii="Times New Roman" w:hAnsi="Times New Roman"/>
+          <w:b w:val="0"/>
+          <w:i w:val="0"/>
+          <w:u w:val="none"/>
+        </w:rPr>
+        <w:t>Рис. 4б. PulseView: запис і читання сторінки – `WREN`, `RDSR` (опитування WIP), `Page program (addr 0x0010F8)`, `Read data (addr 0x0010F8, 16 bytes)`</w:t>
+      </w:r>
+    </w:p>
+    <w:p>
+      <w:pPr>
+        <w:keepNext/>
+        <w:spacing w:before="120"/>
+        <w:jc w:val="center"/>
+      </w:pPr>
+      <w:r>
+        <w:drawing>
+          <wp:inline xmlns:a="http://schemas.openxmlformats.org/drawingml/2006/main" xmlns:pic="http://schemas.openxmlformats.org/drawingml/2006/picture">
+            <wp:extent cx="5760000" cy="1290000"/>
+            <wp:docPr id="12" name="Picture 12"/>
+            <wp:cNvGraphicFramePr>
+              <a:graphicFrameLocks noChangeAspect="1"/>
+            </wp:cNvGraphicFramePr>
+            <a:graphic>
+              <a:graphicData uri="http://schemas.openxmlformats.org/drawingml/2006/picture">
+                <pic:pic>
+                  <pic:nvPicPr>
+                    <pic:cNvPr id="0" name="pulseview_spi_mode3.png"/>
+                    <pic:cNvPicPr/>
+                  </pic:nvPicPr>
+                  <pic:blipFill>
+                    <a:blip r:embed="rId20"/>
+                    <a:stretch>
+                      <a:fillRect/>
+                    </a:stretch>
+                  </pic:blipFill>
+                  <pic:spPr>
+                    <a:xfrm>
+                      <a:off x="0" y="0"/>
+                      <a:ext cx="5760000" cy="1290000"/>
+                    </a:xfrm>
+                    <a:prstGeom prst="rect"/>
+                  </pic:spPr>
+                </pic:pic>
+              </a:graphicData>
+            </a:graphic>
+          </wp:inline>
+        </w:drawing>
+      </w:r>
+    </w:p>
+    <w:p>
+      <w:pPr>
+        <w:spacing w:after="200"/>
+        <w:jc w:val="center"/>
+      </w:pPr>
+      <w:r>
+        <w:rPr>
+          <w:rFonts w:ascii="Times New Roman" w:hAnsi="Times New Roman"/>
+          <w:b w:val="0"/>
+          <w:i w:val="0"/>
+          <w:u w:val="none"/>
+        </w:rPr>
+        <w:t>Рис. 4в. PulseView, аномалія SPI mode 3: декодер mode 0 бачить `CF FF FF FF` і `Unknown command: 0xff` замість `9F`</w:t>
+      </w:r>
+    </w:p>
+    <w:p>
+      <w:pPr>
         <w:spacing w:after="120"/>
         <w:jc w:val="both"/>
       </w:pPr>
@@ -3341,7 +3733,7 @@
         <w:drawing>
           <wp:inline xmlns:a="http://schemas.openxmlformats.org/drawingml/2006/main" xmlns:pic="http://schemas.openxmlformats.org/drawingml/2006/picture">
             <wp:extent cx="5760000" cy="864000"/>
-            <wp:docPr id="6" name="Picture 6"/>
+            <wp:docPr id="13" name="Picture 13"/>
             <wp:cNvGraphicFramePr>
               <a:graphicFrameLocks noChangeAspect="1"/>
             </wp:cNvGraphicFramePr>
@@ -3353,7 +3745,7 @@
                     <pic:cNvPicPr/>
                   </pic:nvPicPr>
                   <pic:blipFill>
-                    <a:blip r:embed="rId14"/>
+                    <a:blip r:embed="rId21"/>
                     <a:stretch>
                       <a:fillRect/>
                     </a:stretch>
@@ -3389,6 +3781,62 @@
     </w:p>
     <w:p>
       <w:pPr>
+        <w:keepNext/>
+        <w:spacing w:before="120"/>
+        <w:jc w:val="center"/>
+      </w:pPr>
+      <w:r>
+        <w:drawing>
+          <wp:inline xmlns:a="http://schemas.openxmlformats.org/drawingml/2006/main" xmlns:pic="http://schemas.openxmlformats.org/drawingml/2006/picture">
+            <wp:extent cx="5760000" cy="780000"/>
+            <wp:docPr id="14" name="Picture 14"/>
+            <wp:cNvGraphicFramePr>
+              <a:graphicFrameLocks noChangeAspect="1"/>
+            </wp:cNvGraphicFramePr>
+            <a:graphic>
+              <a:graphicData uri="http://schemas.openxmlformats.org/drawingml/2006/picture">
+                <pic:pic>
+                  <pic:nvPicPr>
+                    <pic:cNvPr id="0" name="pulseview_uart_banner.png"/>
+                    <pic:cNvPicPr/>
+                  </pic:nvPicPr>
+                  <pic:blipFill>
+                    <a:blip r:embed="rId22"/>
+                    <a:stretch>
+                      <a:fillRect/>
+                    </a:stretch>
+                  </pic:blipFill>
+                  <pic:spPr>
+                    <a:xfrm>
+                      <a:off x="0" y="0"/>
+                      <a:ext cx="5760000" cy="780000"/>
+                    </a:xfrm>
+                    <a:prstGeom prst="rect"/>
+                  </pic:spPr>
+                </pic:pic>
+              </a:graphicData>
+            </a:graphic>
+          </wp:inline>
+        </w:drawing>
+      </w:r>
+    </w:p>
+    <w:p>
+      <w:pPr>
+        <w:spacing w:after="200"/>
+        <w:jc w:val="center"/>
+      </w:pPr>
+      <w:r>
+        <w:rPr>
+          <w:rFonts w:ascii="Times New Roman" w:hAnsi="Times New Roman"/>
+          <w:b w:val="0"/>
+          <w:i w:val="0"/>
+          <w:u w:val="none"/>
+        </w:rPr>
+        <w:t>Рис. 6а. PulseView, декодер UART (RX = D6, 115200 8N1): байти `0D 0A 68 65 6C 6C 6F 20 66 72 6F 6D 20 53 54 4D 33 32 20 28 6C 72 32 29 0D 0A` = `hello from STM32 (lr2)`</w:t>
+      </w:r>
+    </w:p>
+    <w:p>
+      <w:pPr>
         <w:spacing w:after="120"/>
         <w:jc w:val="both"/>
       </w:pPr>
@@ -3466,7 +3914,7 @@
         <w:drawing>
           <wp:inline xmlns:a="http://schemas.openxmlformats.org/drawingml/2006/main" xmlns:pic="http://schemas.openxmlformats.org/drawingml/2006/picture">
             <wp:extent cx="5760000" cy="2304000"/>
-            <wp:docPr id="7" name="Picture 7"/>
+            <wp:docPr id="15" name="Picture 15"/>
             <wp:cNvGraphicFramePr>
               <a:graphicFrameLocks noChangeAspect="1"/>
             </wp:cNvGraphicFramePr>
@@ -3478,7 +3926,7 @@
                     <pic:cNvPicPr/>
                   </pic:nvPicPr>
                   <pic:blipFill>
-                    <a:blip r:embed="rId15"/>
+                    <a:blip r:embed="rId23"/>
                     <a:stretch>
                       <a:fillRect/>
                     </a:stretch>
@@ -3514,6 +3962,62 @@
     </w:p>
     <w:p>
       <w:pPr>
+        <w:keepNext/>
+        <w:spacing w:before="120"/>
+        <w:jc w:val="center"/>
+      </w:pPr>
+      <w:r>
+        <w:drawing>
+          <wp:inline xmlns:a="http://schemas.openxmlformats.org/drawingml/2006/main" xmlns:pic="http://schemas.openxmlformats.org/drawingml/2006/picture">
+            <wp:extent cx="5760000" cy="690000"/>
+            <wp:docPr id="16" name="Picture 16"/>
+            <wp:cNvGraphicFramePr>
+              <a:graphicFrameLocks noChangeAspect="1"/>
+            </wp:cNvGraphicFramePr>
+            <a:graphic>
+              <a:graphicData uri="http://schemas.openxmlformats.org/drawingml/2006/picture">
+                <pic:pic>
+                  <pic:nvPicPr>
+                    <pic:cNvPr id="0" name="pulseview_pwm_demo.png"/>
+                    <pic:cNvPicPr/>
+                  </pic:nvPicPr>
+                  <pic:blipFill>
+                    <a:blip r:embed="rId24"/>
+                    <a:stretch>
+                      <a:fillRect/>
+                    </a:stretch>
+                  </pic:blipFill>
+                  <pic:spPr>
+                    <a:xfrm>
+                      <a:off x="0" y="0"/>
+                      <a:ext cx="5760000" cy="690000"/>
+                    </a:xfrm>
+                    <a:prstGeom prst="rect"/>
+                  </pic:spPr>
+                </pic:pic>
+              </a:graphicData>
+            </a:graphic>
+          </wp:inline>
+        </w:drawing>
+      </w:r>
+    </w:p>
+    <w:p>
+      <w:pPr>
+        <w:spacing w:after="200"/>
+        <w:jc w:val="center"/>
+      </w:pPr>
+      <w:r>
+        <w:rPr>
+          <w:rFonts w:ascii="Times New Roman" w:hAnsi="Times New Roman"/>
+          <w:b w:val="0"/>
+          <w:i w:val="0"/>
+          <w:u w:val="none"/>
+        </w:rPr>
+        <w:t>Рис. 7а. PulseView, декодер PWM (D7): період 20.0 мс, duty cycle 5 % → 10 % → 7.5 % (1000, 2000, 1500 мкс)</w:t>
+      </w:r>
+    </w:p>
+    <w:p>
+      <w:pPr>
         <w:spacing w:after="120"/>
         <w:jc w:val="both"/>
       </w:pPr>
@@ -3553,7 +4057,7 @@
         <w:drawing>
           <wp:inline xmlns:a="http://schemas.openxmlformats.org/drawingml/2006/main" xmlns:pic="http://schemas.openxmlformats.org/drawingml/2006/picture">
             <wp:extent cx="5760000" cy="1705846"/>
-            <wp:docPr id="8" name="Picture 8"/>
+            <wp:docPr id="17" name="Picture 17"/>
             <wp:cNvGraphicFramePr>
               <a:graphicFrameLocks noChangeAspect="1"/>
             </wp:cNvGraphicFramePr>
@@ -3565,7 +4069,7 @@
                     <pic:cNvPicPr/>
                   </pic:nvPicPr>
                   <pic:blipFill>
-                    <a:blip r:embed="rId16"/>
+                    <a:blip r:embed="rId25"/>
                     <a:stretch>
                       <a:fillRect/>
                     </a:stretch>
@@ -4228,6 +4732,62 @@
           <w:u w:val="none"/>
         </w:rPr>
         <w:t>.</w:t>
+      </w:r>
+    </w:p>
+    <w:p>
+      <w:pPr>
+        <w:keepNext/>
+        <w:spacing w:before="120"/>
+        <w:jc w:val="center"/>
+      </w:pPr>
+      <w:r>
+        <w:drawing>
+          <wp:inline xmlns:a="http://schemas.openxmlformats.org/drawingml/2006/main" xmlns:pic="http://schemas.openxmlformats.org/drawingml/2006/picture">
+            <wp:extent cx="5760000" cy="3456000"/>
+            <wp:docPr id="18" name="Picture 18"/>
+            <wp:cNvGraphicFramePr>
+              <a:graphicFrameLocks noChangeAspect="1"/>
+            </wp:cNvGraphicFramePr>
+            <a:graphic>
+              <a:graphicData uri="http://schemas.openxmlformats.org/drawingml/2006/picture">
+                <pic:pic>
+                  <pic:nvPicPr>
+                    <pic:cNvPr id="0" name="component_diagram.png"/>
+                    <pic:cNvPicPr/>
+                  </pic:nvPicPr>
+                  <pic:blipFill>
+                    <a:blip r:embed="rId26"/>
+                    <a:stretch>
+                      <a:fillRect/>
+                    </a:stretch>
+                  </pic:blipFill>
+                  <pic:spPr>
+                    <a:xfrm>
+                      <a:off x="0" y="0"/>
+                      <a:ext cx="5760000" cy="3456000"/>
+                    </a:xfrm>
+                    <a:prstGeom prst="rect"/>
+                  </pic:spPr>
+                </pic:pic>
+              </a:graphicData>
+            </a:graphic>
+          </wp:inline>
+        </w:drawing>
+      </w:r>
+    </w:p>
+    <w:p>
+      <w:pPr>
+        <w:spacing w:after="200"/>
+        <w:jc w:val="center"/>
+      </w:pPr>
+      <w:r>
+        <w:rPr>
+          <w:rFonts w:ascii="Times New Roman" w:hAnsi="Times New Roman"/>
+          <w:b w:val="0"/>
+          <w:i w:val="0"/>
+          <w:u w:val="none"/>
+        </w:rPr>
+        <w:t>Рис. 9. Component diagram: шари Core, App, Platform, Devices, Drivers, хостові тести і напрямок залежностей</w:t>
       </w:r>
     </w:p>
     <w:p>
@@ -5074,7 +5634,7 @@
         </w:rPr>
         <w:t xml:space="preserve">; виправлено у </w:t>
       </w:r>
-      <w:hyperlink r:id="rId17">
+      <w:hyperlink r:id="rId27">
         <w:r>
           <w:rPr>
             <w:color w:val="0563C1"/>
@@ -5165,7 +5725,7 @@
         </w:rPr>
         <w:t xml:space="preserve">, </w:t>
       </w:r>
-      <w:hyperlink r:id="rId17">
+      <w:hyperlink r:id="rId27">
         <w:r>
           <w:rPr>
             <w:color w:val="0563C1"/>
@@ -5305,7 +5865,7 @@
         </w:rPr>
         <w:t xml:space="preserve">, коміт </w:t>
       </w:r>
-      <w:hyperlink r:id="rId18">
+      <w:hyperlink r:id="rId28">
         <w:r>
           <w:rPr>
             <w:color w:val="0563C1"/>
@@ -5429,7 +5989,7 @@
         </w:rPr>
         <w:t xml:space="preserve">, </w:t>
       </w:r>
-      <w:hyperlink r:id="rId19">
+      <w:hyperlink r:id="rId29">
         <w:r>
           <w:rPr>
             <w:color w:val="0563C1"/>
@@ -5534,7 +6094,7 @@
         </w:rPr>
         <w:t xml:space="preserve"> для залізної збірки, </w:t>
       </w:r>
-      <w:hyperlink r:id="rId17">
+      <w:hyperlink r:id="rId27">
         <w:r>
           <w:rPr>
             <w:color w:val="0563C1"/>
@@ -5620,7 +6180,7 @@
         </w:rPr>
         <w:t xml:space="preserve">), відновлення після таймауту перемиканням PE, </w:t>
       </w:r>
-      <w:hyperlink r:id="rId17">
+      <w:hyperlink r:id="rId27">
         <w:r>
           <w:rPr>
             <w:color w:val="0563C1"/>
@@ -5725,7 +6285,7 @@
         </w:rPr>
         <w:t xml:space="preserve">), </w:t>
       </w:r>
-      <w:hyperlink r:id="rId20">
+      <w:hyperlink r:id="rId30">
         <w:r>
           <w:rPr>
             <w:color w:val="0563C1"/>
@@ -5830,7 +6390,7 @@
         </w:rPr>
         <w:t xml:space="preserve"> відтворює всі декодування, </w:t>
       </w:r>
-      <w:hyperlink r:id="rId21">
+      <w:hyperlink r:id="rId31">
         <w:r>
           <w:rPr>
             <w:color w:val="0563C1"/>
@@ -5992,7 +6552,7 @@
         </w:rPr>
         <w:t xml:space="preserve"> → raw = 300 (242 мВ), що збігається з 75/1023 · 3.3 В, </w:t>
       </w:r>
-      <w:hyperlink r:id="rId22">
+      <w:hyperlink r:id="rId32">
         <w:r>
           <w:rPr>
             <w:color w:val="0563C1"/>
@@ -6192,7 +6752,7 @@
         </w:rPr>
         <w:t xml:space="preserve">, </w:t>
       </w:r>
-      <w:hyperlink r:id="rId18">
+      <w:hyperlink r:id="rId28">
         <w:r>
           <w:rPr>
             <w:color w:val="0563C1"/>
@@ -8940,7 +9500,7 @@
         <w:drawing>
           <wp:inline xmlns:a="http://schemas.openxmlformats.org/drawingml/2006/main" xmlns:pic="http://schemas.openxmlformats.org/drawingml/2006/picture">
             <wp:extent cx="5760000" cy="3244557"/>
-            <wp:docPr id="9" name="Picture 9"/>
+            <wp:docPr id="19" name="Picture 19"/>
             <wp:cNvGraphicFramePr>
               <a:graphicFrameLocks noChangeAspect="1"/>
             </wp:cNvGraphicFramePr>
@@ -8952,7 +9512,7 @@
                     <pic:cNvPicPr/>
                   </pic:nvPicPr>
                   <pic:blipFill>
-                    <a:blip r:embed="rId23"/>
+                    <a:blip r:embed="rId33"/>
                     <a:stretch>
                       <a:fillRect/>
                     </a:stretch>
@@ -8996,7 +9556,7 @@
         <w:drawing>
           <wp:inline xmlns:a="http://schemas.openxmlformats.org/drawingml/2006/main" xmlns:pic="http://schemas.openxmlformats.org/drawingml/2006/picture">
             <wp:extent cx="5760000" cy="3481519"/>
-            <wp:docPr id="10" name="Picture 10"/>
+            <wp:docPr id="20" name="Picture 20"/>
             <wp:cNvGraphicFramePr>
               <a:graphicFrameLocks noChangeAspect="1"/>
             </wp:cNvGraphicFramePr>
@@ -9008,7 +9568,7 @@
                     <pic:cNvPicPr/>
                   </pic:nvPicPr>
                   <pic:blipFill>
-                    <a:blip r:embed="rId24"/>
+                    <a:blip r:embed="rId34"/>
                     <a:stretch>
                       <a:fillRect/>
                     </a:stretch>
@@ -9052,7 +9612,7 @@
         <w:drawing>
           <wp:inline xmlns:a="http://schemas.openxmlformats.org/drawingml/2006/main" xmlns:pic="http://schemas.openxmlformats.org/drawingml/2006/picture">
             <wp:extent cx="5760000" cy="3090000"/>
-            <wp:docPr id="11" name="Picture 11"/>
+            <wp:docPr id="21" name="Picture 21"/>
             <wp:cNvGraphicFramePr>
               <a:graphicFrameLocks noChangeAspect="1"/>
             </wp:cNvGraphicFramePr>
@@ -9064,7 +9624,7 @@
                     <pic:cNvPicPr/>
                   </pic:nvPicPr>
                   <pic:blipFill>
-                    <a:blip r:embed="rId25"/>
+                    <a:blip r:embed="rId35"/>
                     <a:stretch>
                       <a:fillRect/>
                     </a:stretch>
@@ -9108,7 +9668,7 @@
         <w:drawing>
           <wp:inline xmlns:a="http://schemas.openxmlformats.org/drawingml/2006/main" xmlns:pic="http://schemas.openxmlformats.org/drawingml/2006/picture">
             <wp:extent cx="5760000" cy="3090000"/>
-            <wp:docPr id="12" name="Picture 12"/>
+            <wp:docPr id="22" name="Picture 22"/>
             <wp:cNvGraphicFramePr>
               <a:graphicFrameLocks noChangeAspect="1"/>
             </wp:cNvGraphicFramePr>
@@ -9120,7 +9680,7 @@
                     <pic:cNvPicPr/>
                   </pic:nvPicPr>
                   <pic:blipFill>
-                    <a:blip r:embed="rId26"/>
+                    <a:blip r:embed="rId36"/>
                     <a:stretch>
                       <a:fillRect/>
                     </a:stretch>
@@ -9164,7 +9724,7 @@
         <w:drawing>
           <wp:inline xmlns:a="http://schemas.openxmlformats.org/drawingml/2006/main" xmlns:pic="http://schemas.openxmlformats.org/drawingml/2006/picture">
             <wp:extent cx="5760000" cy="3090000"/>
-            <wp:docPr id="13" name="Picture 13"/>
+            <wp:docPr id="23" name="Picture 23"/>
             <wp:cNvGraphicFramePr>
               <a:graphicFrameLocks noChangeAspect="1"/>
             </wp:cNvGraphicFramePr>
@@ -9176,7 +9736,7 @@
                     <pic:cNvPicPr/>
                   </pic:nvPicPr>
                   <pic:blipFill>
-                    <a:blip r:embed="rId27"/>
+                    <a:blip r:embed="rId37"/>
                     <a:stretch>
                       <a:fillRect/>
                     </a:stretch>
@@ -9220,7 +9780,7 @@
         <w:drawing>
           <wp:inline xmlns:a="http://schemas.openxmlformats.org/drawingml/2006/main" xmlns:pic="http://schemas.openxmlformats.org/drawingml/2006/picture">
             <wp:extent cx="5760000" cy="3090000"/>
-            <wp:docPr id="14" name="Picture 14"/>
+            <wp:docPr id="24" name="Picture 24"/>
             <wp:cNvGraphicFramePr>
               <a:graphicFrameLocks noChangeAspect="1"/>
             </wp:cNvGraphicFramePr>
@@ -9232,7 +9792,7 @@
                     <pic:cNvPicPr/>
                   </pic:nvPicPr>
                   <pic:blipFill>
-                    <a:blip r:embed="rId28"/>
+                    <a:blip r:embed="rId38"/>
                     <a:stretch>
                       <a:fillRect/>
                     </a:stretch>
@@ -9276,7 +9836,7 @@
         <w:drawing>
           <wp:inline xmlns:a="http://schemas.openxmlformats.org/drawingml/2006/main" xmlns:pic="http://schemas.openxmlformats.org/drawingml/2006/picture">
             <wp:extent cx="5760000" cy="5524645"/>
-            <wp:docPr id="15" name="Picture 15"/>
+            <wp:docPr id="25" name="Picture 25"/>
             <wp:cNvGraphicFramePr>
               <a:graphicFrameLocks noChangeAspect="1"/>
             </wp:cNvGraphicFramePr>
@@ -9288,7 +9848,7 @@
                     <pic:cNvPicPr/>
                   </pic:nvPicPr>
                   <pic:blipFill>
-                    <a:blip r:embed="rId29"/>
+                    <a:blip r:embed="rId39"/>
                     <a:stretch>
                       <a:fillRect/>
                     </a:stretch>
@@ -9332,7 +9892,7 @@
         <w:drawing>
           <wp:inline xmlns:a="http://schemas.openxmlformats.org/drawingml/2006/main" xmlns:pic="http://schemas.openxmlformats.org/drawingml/2006/picture">
             <wp:extent cx="4836233" cy="7559999"/>
-            <wp:docPr id="16" name="Picture 16"/>
+            <wp:docPr id="26" name="Picture 26"/>
             <wp:cNvGraphicFramePr>
               <a:graphicFrameLocks noChangeAspect="1"/>
             </wp:cNvGraphicFramePr>
@@ -9344,7 +9904,7 @@
                     <pic:cNvPicPr/>
                   </pic:nvPicPr>
                   <pic:blipFill>
-                    <a:blip r:embed="rId30"/>
+                    <a:blip r:embed="rId40"/>
                     <a:stretch>
                       <a:fillRect/>
                     </a:stretch>
@@ -9388,7 +9948,7 @@
         <w:drawing>
           <wp:inline xmlns:a="http://schemas.openxmlformats.org/drawingml/2006/main" xmlns:pic="http://schemas.openxmlformats.org/drawingml/2006/picture">
             <wp:extent cx="5760000" cy="4206316"/>
-            <wp:docPr id="17" name="Picture 17"/>
+            <wp:docPr id="27" name="Picture 27"/>
             <wp:cNvGraphicFramePr>
               <a:graphicFrameLocks noChangeAspect="1"/>
             </wp:cNvGraphicFramePr>
@@ -9400,7 +9960,7 @@
                     <pic:cNvPicPr/>
                   </pic:nvPicPr>
                   <pic:blipFill>
-                    <a:blip r:embed="rId31"/>
+                    <a:blip r:embed="rId41"/>
                     <a:stretch>
                       <a:fillRect/>
                     </a:stretch>
@@ -9444,7 +10004,7 @@
         <w:drawing>
           <wp:inline xmlns:a="http://schemas.openxmlformats.org/drawingml/2006/main" xmlns:pic="http://schemas.openxmlformats.org/drawingml/2006/picture">
             <wp:extent cx="5760000" cy="1810286"/>
-            <wp:docPr id="18" name="Picture 18"/>
+            <wp:docPr id="28" name="Picture 28"/>
             <wp:cNvGraphicFramePr>
               <a:graphicFrameLocks noChangeAspect="1"/>
             </wp:cNvGraphicFramePr>
@@ -9456,7 +10016,7 @@
                     <pic:cNvPicPr/>
                   </pic:nvPicPr>
                   <pic:blipFill>
-                    <a:blip r:embed="rId32"/>
+                    <a:blip r:embed="rId42"/>
                     <a:stretch>
                       <a:fillRect/>
                     </a:stretch>
@@ -9500,7 +10060,7 @@
         <w:drawing>
           <wp:inline xmlns:a="http://schemas.openxmlformats.org/drawingml/2006/main" xmlns:pic="http://schemas.openxmlformats.org/drawingml/2006/picture">
             <wp:extent cx="5760000" cy="3276000"/>
-            <wp:docPr id="19" name="Picture 19"/>
+            <wp:docPr id="29" name="Picture 29"/>
             <wp:cNvGraphicFramePr>
               <a:graphicFrameLocks noChangeAspect="1"/>
             </wp:cNvGraphicFramePr>
@@ -9512,7 +10072,7 @@
                     <pic:cNvPicPr/>
                   </pic:nvPicPr>
                   <pic:blipFill>
-                    <a:blip r:embed="rId33"/>
+                    <a:blip r:embed="rId43"/>
                     <a:stretch>
                       <a:fillRect/>
                     </a:stretch>
@@ -9787,7 +10347,7 @@
       </w:r>
     </w:p>
     <w:sectPr>
-      <w:footerReference w:type="default" r:id="rId34"/>
+      <w:footerReference w:type="default" r:id="rId44"/>
       <w:pgSz w:w="11906" w:h="16838"/>
       <w:pgMar w:top="1134" w:right="850" w:bottom="1134" w:left="1417" w:header="720" w:footer="720" w:gutter="0"/>
       <w:cols w:space="720"/>

</xml_diff>

<commit_message>
Report: PulseView screenshot for the ADC marker window
</commit_message>
<xml_diff>
--- a/docs/LR2_report.docx
+++ b/docs/LR2_report.docx
@@ -2714,7 +2714,7 @@
       <w:r>
         <w:drawing>
           <wp:inline xmlns:a="http://schemas.openxmlformats.org/drawingml/2006/main" xmlns:pic="http://schemas.openxmlformats.org/drawingml/2006/picture">
-            <wp:extent cx="5760000" cy="1284923"/>
+            <wp:extent cx="5760000" cy="810000"/>
             <wp:docPr id="1" name="Picture 1"/>
             <wp:cNvGraphicFramePr>
               <a:graphicFrameLocks noChangeAspect="1"/>
@@ -2723,7 +2723,7 @@
               <a:graphicData uri="http://schemas.openxmlformats.org/drawingml/2006/picture">
                 <pic:pic>
                   <pic:nvPicPr>
-                    <pic:cNvPr id="0" name="i2c_whoami.png"/>
+                    <pic:cNvPr id="0" name="pulseview_i2c_whoami.png"/>
                     <pic:cNvPicPr/>
                   </pic:nvPicPr>
                   <pic:blipFill>
@@ -2735,7 +2735,7 @@
                   <pic:spPr>
                     <a:xfrm>
                       <a:off x="0" y="0"/>
-                      <a:ext cx="5760000" cy="1284923"/>
+                      <a:ext cx="5760000" cy="810000"/>
                     </a:xfrm>
                     <a:prstGeom prst="rect"/>
                   </pic:spPr>
@@ -2758,7 +2758,75 @@
           <w:i w:val="0"/>
           <w:u w:val="none"/>
         </w:rPr>
-        <w:t>Рис. 1. I2C1: читання WHO_AM_I (0x75) з MPU-6050</w:t>
+        <w:t>Рис. 1. PulseView, декодер I²C (SCL = D0, SDA = D1): `S`, `Address write: 68`, `W`, `A`, `Data write: 75`, `A`, `P`, `S`, `Address read: 68`, `R`, `A`, `Data read: 68`, `N`, `P`</w:t>
+      </w:r>
+    </w:p>
+    <w:p>
+      <w:pPr>
+        <w:spacing w:after="120"/>
+        <w:jc w:val="both"/>
+      </w:pPr>
+      <w:r>
+        <w:rPr>
+          <w:rFonts w:ascii="Times New Roman" w:hAnsi="Times New Roman"/>
+          <w:b w:val="0"/>
+          <w:i w:val="0"/>
+          <w:u w:val="none"/>
+        </w:rPr>
+        <w:t xml:space="preserve">Декодування sigrok: </w:t>
+      </w:r>
+      <w:r>
+        <w:rPr>
+          <w:rFonts w:ascii="Courier New" w:hAnsi="Courier New" w:eastAsia="Courier New"/>
+          <w:b w:val="0"/>
+          <w:i w:val="0"/>
+          <w:sz w:val="24"/>
+          <w:u w:val="none"/>
+        </w:rPr>
+        <w:t>Start, Address write 68 ACK, Data write 75 ACK, Stop, Start, Address read 68 ACK, Data read 68 NACK, Stop</w:t>
+      </w:r>
+      <w:r>
+        <w:rPr>
+          <w:rFonts w:ascii="Times New Roman" w:hAnsi="Times New Roman"/>
+          <w:b w:val="0"/>
+          <w:i w:val="0"/>
+          <w:u w:val="none"/>
+        </w:rPr>
+        <w:t>. Значення WHO_AM_I = 0x68 збігається з Register Map. Виміряно: період SCL 10.00 мкс (100.0 кГц), ширина високого рівня 5.00 мкс, запис регістра (START→STOP) 197.25 мкс, пакетне читання 14 байтів 1365 мкс. Розрахунок за TIMINGR 0x10805D88: tSCLL = 5.71 мкс, tSCLH = 3.92 мкс, період ≈ 9.63 мкс + фронти → збіг у межах 4 %.</w:t>
+      </w:r>
+    </w:p>
+    <w:p>
+      <w:pPr>
+        <w:spacing w:after="120"/>
+        <w:jc w:val="both"/>
+      </w:pPr>
+      <w:r>
+        <w:rPr>
+          <w:rFonts w:ascii="Times New Roman" w:hAnsi="Times New Roman"/>
+          <w:b w:val="0"/>
+          <w:i w:val="0"/>
+          <w:u w:val="none"/>
+        </w:rPr>
+        <w:t xml:space="preserve">Ручне декодування байта: SDA у моменти дев'яти наростаючих фронтів SCL = </w:t>
+      </w:r>
+      <w:r>
+        <w:rPr>
+          <w:rFonts w:ascii="Courier New" w:hAnsi="Courier New" w:eastAsia="Courier New"/>
+          <w:b w:val="0"/>
+          <w:i w:val="0"/>
+          <w:sz w:val="24"/>
+          <w:u w:val="none"/>
+        </w:rPr>
+        <w:t>1 1 0 1 0 0 0 0 | 0</w:t>
+      </w:r>
+      <w:r>
+        <w:rPr>
+          <w:rFonts w:ascii="Times New Roman" w:hAnsi="Times New Roman"/>
+          <w:b w:val="0"/>
+          <w:i w:val="0"/>
+          <w:u w:val="none"/>
+        </w:rPr>
+        <w:t xml:space="preserve"> → 0xD0 = (0x68 &lt;&lt; 1) | 0 (запис), дев'ятий біт 0 – ACK.</w:t>
       </w:r>
     </w:p>
     <w:p>
@@ -2779,7 +2847,7 @@
               <a:graphicData uri="http://schemas.openxmlformats.org/drawingml/2006/picture">
                 <pic:pic>
                   <pic:nvPicPr>
-                    <pic:cNvPr id="0" name="pulseview_i2c_whoami.png"/>
+                    <pic:cNvPr id="0" name="pulseview_i2c_init.png"/>
                     <pic:cNvPicPr/>
                   </pic:nvPicPr>
                   <pic:blipFill>
@@ -2814,75 +2882,7 @@
           <w:i w:val="0"/>
           <w:u w:val="none"/>
         </w:rPr>
-        <w:t>Рис. 1а. PulseView, декодер I²C (SCL = D0, SDA = D1): `S`, `Address write: 68`, `W`, `A`, `Data write: 75`, `A`, `P`, `S`, `Address read: 68`, `R`, `A`, `Data read: 68`, `N`, `P`</w:t>
-      </w:r>
-    </w:p>
-    <w:p>
-      <w:pPr>
-        <w:spacing w:after="120"/>
-        <w:jc w:val="both"/>
-      </w:pPr>
-      <w:r>
-        <w:rPr>
-          <w:rFonts w:ascii="Times New Roman" w:hAnsi="Times New Roman"/>
-          <w:b w:val="0"/>
-          <w:i w:val="0"/>
-          <w:u w:val="none"/>
-        </w:rPr>
-        <w:t xml:space="preserve">Декодування sigrok: </w:t>
-      </w:r>
-      <w:r>
-        <w:rPr>
-          <w:rFonts w:ascii="Courier New" w:hAnsi="Courier New" w:eastAsia="Courier New"/>
-          <w:b w:val="0"/>
-          <w:i w:val="0"/>
-          <w:sz w:val="24"/>
-          <w:u w:val="none"/>
-        </w:rPr>
-        <w:t>Start, Address write 68 ACK, Data write 75 ACK, Stop, Start, Address read 68 ACK, Data read 68 NACK, Stop</w:t>
-      </w:r>
-      <w:r>
-        <w:rPr>
-          <w:rFonts w:ascii="Times New Roman" w:hAnsi="Times New Roman"/>
-          <w:b w:val="0"/>
-          <w:i w:val="0"/>
-          <w:u w:val="none"/>
-        </w:rPr>
-        <w:t>. Значення WHO_AM_I = 0x68 збігається з Register Map. Виміряно: період SCL 10.00 мкс (100.0 кГц), ширина високого рівня 5.00 мкс, запис регістра (START→STOP) 197.25 мкс, пакетне читання 14 байтів 1365 мкс. Розрахунок за TIMINGR 0x10805D88: tSCLL = 5.71 мкс, tSCLH = 3.92 мкс, період ≈ 9.63 мкс + фронти → збіг у межах 4 %.</w:t>
-      </w:r>
-    </w:p>
-    <w:p>
-      <w:pPr>
-        <w:spacing w:after="120"/>
-        <w:jc w:val="both"/>
-      </w:pPr>
-      <w:r>
-        <w:rPr>
-          <w:rFonts w:ascii="Times New Roman" w:hAnsi="Times New Roman"/>
-          <w:b w:val="0"/>
-          <w:i w:val="0"/>
-          <w:u w:val="none"/>
-        </w:rPr>
-        <w:t xml:space="preserve">Ручне декодування байта: SDA у моменти дев'яти наростаючих фронтів SCL = </w:t>
-      </w:r>
-      <w:r>
-        <w:rPr>
-          <w:rFonts w:ascii="Courier New" w:hAnsi="Courier New" w:eastAsia="Courier New"/>
-          <w:b w:val="0"/>
-          <w:i w:val="0"/>
-          <w:sz w:val="24"/>
-          <w:u w:val="none"/>
-        </w:rPr>
-        <w:t>1 1 0 1 0 0 0 0 | 0</w:t>
-      </w:r>
-      <w:r>
-        <w:rPr>
-          <w:rFonts w:ascii="Times New Roman" w:hAnsi="Times New Roman"/>
-          <w:b w:val="0"/>
-          <w:i w:val="0"/>
-          <w:u w:val="none"/>
-        </w:rPr>
-        <w:t xml:space="preserve"> → 0xD0 = (0x68 &lt;&lt; 1) | 0 (запис), дев'ятий біт 0 – ACK.</w:t>
+        <w:t>Рис. 2. PulseView: п'ять записів у регістри MPU-6050 (AW 68, DW 6B 01 / 19 13 / 1A 03 / 1B 00 / 1C 00), перед ними перевірка WHO_AM_I</w:t>
       </w:r>
     </w:p>
     <w:p>
@@ -2894,7 +2894,7 @@
       <w:r>
         <w:drawing>
           <wp:inline xmlns:a="http://schemas.openxmlformats.org/drawingml/2006/main" xmlns:pic="http://schemas.openxmlformats.org/drawingml/2006/picture">
-            <wp:extent cx="5760000" cy="1284923"/>
+            <wp:extent cx="5760000" cy="810000"/>
             <wp:docPr id="3" name="Picture 3"/>
             <wp:cNvGraphicFramePr>
               <a:graphicFrameLocks noChangeAspect="1"/>
@@ -2903,7 +2903,7 @@
               <a:graphicData uri="http://schemas.openxmlformats.org/drawingml/2006/picture">
                 <pic:pic>
                   <pic:nvPicPr>
-                    <pic:cNvPr id="0" name="i2c_init.png"/>
+                    <pic:cNvPr id="0" name="pulseview_i2c_burst.png"/>
                     <pic:cNvPicPr/>
                   </pic:nvPicPr>
                   <pic:blipFill>
@@ -2915,7 +2915,7 @@
                   <pic:spPr>
                     <a:xfrm>
                       <a:off x="0" y="0"/>
-                      <a:ext cx="5760000" cy="1284923"/>
+                      <a:ext cx="5760000" cy="810000"/>
                     </a:xfrm>
                     <a:prstGeom prst="rect"/>
                   </pic:spPr>
@@ -2938,7 +2938,41 @@
           <w:i w:val="0"/>
           <w:u w:val="none"/>
         </w:rPr>
-        <w:t>Рис. 2. Ініціалізація MPU-6050</w:t>
+        <w:t>Рис. 3. PulseView: пакетне читання 14 байтів від регістра 0x3B (DW 3B, потім AR 68 і 14 байтів даних, останній – NACK)</w:t>
+      </w:r>
+    </w:p>
+    <w:p>
+      <w:pPr>
+        <w:spacing w:after="120"/>
+        <w:jc w:val="both"/>
+      </w:pPr>
+      <w:r>
+        <w:rPr>
+          <w:rFonts w:ascii="Times New Roman" w:hAnsi="Times New Roman"/>
+          <w:b w:val="0"/>
+          <w:i w:val="0"/>
+          <w:u w:val="none"/>
+        </w:rPr>
+        <w:t xml:space="preserve">Ініціалізація: PWR_MGMT_1 ← 0x01, SMPLRT_DIV ← 0x13 (50 Гц), CONFIG ← 0x03 (DLPF 44 Гц), GYRO_CONFIG ← 0x00 (±250 °/с), ACCEL_CONFIG ← 0x00 (±2 g). Пакетне читання (14 байтів від 0x3B): </w:t>
+      </w:r>
+      <w:r>
+        <w:rPr>
+          <w:rFonts w:ascii="Courier New" w:hAnsi="Courier New" w:eastAsia="Courier New"/>
+          <w:b w:val="0"/>
+          <w:i w:val="0"/>
+          <w:sz w:val="24"/>
+          <w:u w:val="none"/>
+        </w:rPr>
+        <w:t>00 00 00 00 40 00 EF 5C 00 …</w:t>
+      </w:r>
+      <w:r>
+        <w:rPr>
+          <w:rFonts w:ascii="Times New Roman" w:hAnsi="Times New Roman"/>
+          <w:b w:val="0"/>
+          <w:i w:val="0"/>
+          <w:u w:val="none"/>
+        </w:rPr>
+        <w:t xml:space="preserve"> → az = 16384 LSB = 1 g, температура 24.0 °C за формулою Register Map.</w:t>
       </w:r>
     </w:p>
     <w:p>
@@ -2959,7 +2993,7 @@
               <a:graphicData uri="http://schemas.openxmlformats.org/drawingml/2006/picture">
                 <pic:pic>
                   <pic:nvPicPr>
-                    <pic:cNvPr id="0" name="pulseview_i2c_init.png"/>
+                    <pic:cNvPr id="0" name="pulseview_i2c_nack.png"/>
                     <pic:cNvPicPr/>
                   </pic:nvPicPr>
                   <pic:blipFill>
@@ -2994,7 +3028,95 @@
           <w:i w:val="0"/>
           <w:u w:val="none"/>
         </w:rPr>
-        <w:t>Рис. 2а. PulseView: п'ять записів у регістри MPU-6050 (AW 68, DW 6B 01 / 19 13 / 1A 03 / 1B 00 / 1C 00), перед ними перевірка WHO_AM_I</w:t>
+        <w:t>Рис. 4. PulseView: `Address write: 69` завершується `NACK`, далі `P` – пристрій з такою адресою відсутній</w:t>
+      </w:r>
+    </w:p>
+    <w:p>
+      <w:pPr>
+        <w:spacing w:after="120"/>
+        <w:jc w:val="both"/>
+      </w:pPr>
+      <w:r>
+        <w:rPr>
+          <w:rFonts w:ascii="Times New Roman" w:hAnsi="Times New Roman"/>
+          <w:b w:val="0"/>
+          <w:i w:val="0"/>
+          <w:u w:val="none"/>
+        </w:rPr>
+        <w:t xml:space="preserve">Аномалії: (1) адреса 0x69 (AD0 = VCC) – NACK на дев'ятому такті, SDA лишається високою; драйвер розрізняє </w:t>
+      </w:r>
+      <w:r>
+        <w:rPr>
+          <w:rFonts w:ascii="Courier New" w:hAnsi="Courier New" w:eastAsia="Courier New"/>
+          <w:b w:val="0"/>
+          <w:i w:val="0"/>
+          <w:sz w:val="24"/>
+          <w:u w:val="none"/>
+        </w:rPr>
+        <w:t>NACK</w:t>
+      </w:r>
+      <w:r>
+        <w:rPr>
+          <w:rFonts w:ascii="Times New Roman" w:hAnsi="Times New Roman"/>
+          <w:b w:val="0"/>
+          <w:i w:val="0"/>
+          <w:u w:val="none"/>
+        </w:rPr>
+        <w:t xml:space="preserve"> і </w:t>
+      </w:r>
+      <w:r>
+        <w:rPr>
+          <w:rFonts w:ascii="Courier New" w:hAnsi="Courier New" w:eastAsia="Courier New"/>
+          <w:b w:val="0"/>
+          <w:i w:val="0"/>
+          <w:sz w:val="24"/>
+          <w:u w:val="none"/>
+        </w:rPr>
+        <w:t>TIMEOUT</w:t>
+      </w:r>
+      <w:r>
+        <w:rPr>
+          <w:rFonts w:ascii="Times New Roman" w:hAnsi="Times New Roman"/>
+          <w:b w:val="0"/>
+          <w:i w:val="0"/>
+          <w:u w:val="none"/>
+        </w:rPr>
+        <w:t xml:space="preserve">. (2) Між записом адреси регістра і читанням є STOP, а не повторний START (обхід моделі I2C у Wokwi); реальний чіп це приймає, але на залізі слід увімкнути </w:t>
+      </w:r>
+      <w:r>
+        <w:rPr>
+          <w:rFonts w:ascii="Courier New" w:hAnsi="Courier New" w:eastAsia="Courier New"/>
+          <w:b w:val="0"/>
+          <w:i w:val="0"/>
+          <w:sz w:val="24"/>
+          <w:u w:val="none"/>
+        </w:rPr>
+        <w:t>BOARD_I2C_REPEATED_START</w:t>
+      </w:r>
+      <w:r>
+        <w:rPr>
+          <w:rFonts w:ascii="Times New Roman" w:hAnsi="Times New Roman"/>
+          <w:b w:val="0"/>
+          <w:i w:val="0"/>
+          <w:u w:val="none"/>
+        </w:rPr>
+        <w:t>.</w:t>
+      </w:r>
+    </w:p>
+    <w:p>
+      <w:pPr>
+        <w:keepNext/>
+        <w:spacing w:after="120"/>
+        <w:jc w:val="left"/>
+      </w:pPr>
+      <w:r>
+        <w:rPr>
+          <w:rFonts w:ascii="Times New Roman" w:hAnsi="Times New Roman"/>
+          <w:b/>
+          <w:i w:val="0"/>
+          <w:u w:val="none"/>
+        </w:rPr>
+        <w:t>4.2 SPI</w:t>
       </w:r>
     </w:p>
     <w:p>
@@ -3006,410 +3128,8 @@
       <w:r>
         <w:drawing>
           <wp:inline xmlns:a="http://schemas.openxmlformats.org/drawingml/2006/main" xmlns:pic="http://schemas.openxmlformats.org/drawingml/2006/picture">
-            <wp:extent cx="5760000" cy="810000"/>
+            <wp:extent cx="5760000" cy="1350000"/>
             <wp:docPr id="5" name="Picture 5"/>
-            <wp:cNvGraphicFramePr>
-              <a:graphicFrameLocks noChangeAspect="1"/>
-            </wp:cNvGraphicFramePr>
-            <a:graphic>
-              <a:graphicData uri="http://schemas.openxmlformats.org/drawingml/2006/picture">
-                <pic:pic>
-                  <pic:nvPicPr>
-                    <pic:cNvPr id="0" name="pulseview_i2c_burst.png"/>
-                    <pic:cNvPicPr/>
-                  </pic:nvPicPr>
-                  <pic:blipFill>
-                    <a:blip r:embed="rId13"/>
-                    <a:stretch>
-                      <a:fillRect/>
-                    </a:stretch>
-                  </pic:blipFill>
-                  <pic:spPr>
-                    <a:xfrm>
-                      <a:off x="0" y="0"/>
-                      <a:ext cx="5760000" cy="810000"/>
-                    </a:xfrm>
-                    <a:prstGeom prst="rect"/>
-                  </pic:spPr>
-                </pic:pic>
-              </a:graphicData>
-            </a:graphic>
-          </wp:inline>
-        </w:drawing>
-      </w:r>
-    </w:p>
-    <w:p>
-      <w:pPr>
-        <w:spacing w:after="200"/>
-        <w:jc w:val="center"/>
-      </w:pPr>
-      <w:r>
-        <w:rPr>
-          <w:rFonts w:ascii="Times New Roman" w:hAnsi="Times New Roman"/>
-          <w:b w:val="0"/>
-          <w:i w:val="0"/>
-          <w:u w:val="none"/>
-        </w:rPr>
-        <w:t>Рис. 2б. PulseView: пакетне читання 14 байтів від регістра 0x3B (DW 3B, потім AR 68 і 14 байтів даних, останній – NACK)</w:t>
-      </w:r>
-    </w:p>
-    <w:p>
-      <w:pPr>
-        <w:spacing w:after="120"/>
-        <w:jc w:val="both"/>
-      </w:pPr>
-      <w:r>
-        <w:rPr>
-          <w:rFonts w:ascii="Times New Roman" w:hAnsi="Times New Roman"/>
-          <w:b w:val="0"/>
-          <w:i w:val="0"/>
-          <w:u w:val="none"/>
-        </w:rPr>
-        <w:t xml:space="preserve">Ініціалізація: PWR_MGMT_1 ← 0x01, SMPLRT_DIV ← 0x13 (50 Гц), CONFIG ← 0x03 (DLPF 44 Гц), GYRO_CONFIG ← 0x00 (±250 °/с), ACCEL_CONFIG ← 0x00 (±2 g). Пакетне читання (14 байтів від 0x3B): </w:t>
-      </w:r>
-      <w:r>
-        <w:rPr>
-          <w:rFonts w:ascii="Courier New" w:hAnsi="Courier New" w:eastAsia="Courier New"/>
-          <w:b w:val="0"/>
-          <w:i w:val="0"/>
-          <w:sz w:val="24"/>
-          <w:u w:val="none"/>
-        </w:rPr>
-        <w:t>00 00 00 00 40 00 EF 5C 00 …</w:t>
-      </w:r>
-      <w:r>
-        <w:rPr>
-          <w:rFonts w:ascii="Times New Roman" w:hAnsi="Times New Roman"/>
-          <w:b w:val="0"/>
-          <w:i w:val="0"/>
-          <w:u w:val="none"/>
-        </w:rPr>
-        <w:t xml:space="preserve"> → az = 16384 LSB = 1 g, температура 24.0 °C за формулою Register Map.</w:t>
-      </w:r>
-    </w:p>
-    <w:p>
-      <w:pPr>
-        <w:keepNext/>
-        <w:spacing w:before="120"/>
-        <w:jc w:val="center"/>
-      </w:pPr>
-      <w:r>
-        <w:drawing>
-          <wp:inline xmlns:a="http://schemas.openxmlformats.org/drawingml/2006/main" xmlns:pic="http://schemas.openxmlformats.org/drawingml/2006/picture">
-            <wp:extent cx="5760000" cy="1284923"/>
-            <wp:docPr id="6" name="Picture 6"/>
-            <wp:cNvGraphicFramePr>
-              <a:graphicFrameLocks noChangeAspect="1"/>
-            </wp:cNvGraphicFramePr>
-            <a:graphic>
-              <a:graphicData uri="http://schemas.openxmlformats.org/drawingml/2006/picture">
-                <pic:pic>
-                  <pic:nvPicPr>
-                    <pic:cNvPr id="0" name="i2c_nack.png"/>
-                    <pic:cNvPicPr/>
-                  </pic:nvPicPr>
-                  <pic:blipFill>
-                    <a:blip r:embed="rId14"/>
-                    <a:stretch>
-                      <a:fillRect/>
-                    </a:stretch>
-                  </pic:blipFill>
-                  <pic:spPr>
-                    <a:xfrm>
-                      <a:off x="0" y="0"/>
-                      <a:ext cx="5760000" cy="1284923"/>
-                    </a:xfrm>
-                    <a:prstGeom prst="rect"/>
-                  </pic:spPr>
-                </pic:pic>
-              </a:graphicData>
-            </a:graphic>
-          </wp:inline>
-        </w:drawing>
-      </w:r>
-    </w:p>
-    <w:p>
-      <w:pPr>
-        <w:spacing w:after="200"/>
-        <w:jc w:val="center"/>
-      </w:pPr>
-      <w:r>
-        <w:rPr>
-          <w:rFonts w:ascii="Times New Roman" w:hAnsi="Times New Roman"/>
-          <w:b w:val="0"/>
-          <w:i w:val="0"/>
-          <w:u w:val="none"/>
-        </w:rPr>
-        <w:t>Рис. 3. Аномалія: адреса 0x69 – NACK</w:t>
-      </w:r>
-    </w:p>
-    <w:p>
-      <w:pPr>
-        <w:keepNext/>
-        <w:spacing w:before="120"/>
-        <w:jc w:val="center"/>
-      </w:pPr>
-      <w:r>
-        <w:drawing>
-          <wp:inline xmlns:a="http://schemas.openxmlformats.org/drawingml/2006/main" xmlns:pic="http://schemas.openxmlformats.org/drawingml/2006/picture">
-            <wp:extent cx="5760000" cy="810000"/>
-            <wp:docPr id="7" name="Picture 7"/>
-            <wp:cNvGraphicFramePr>
-              <a:graphicFrameLocks noChangeAspect="1"/>
-            </wp:cNvGraphicFramePr>
-            <a:graphic>
-              <a:graphicData uri="http://schemas.openxmlformats.org/drawingml/2006/picture">
-                <pic:pic>
-                  <pic:nvPicPr>
-                    <pic:cNvPr id="0" name="pulseview_i2c_nack.png"/>
-                    <pic:cNvPicPr/>
-                  </pic:nvPicPr>
-                  <pic:blipFill>
-                    <a:blip r:embed="rId15"/>
-                    <a:stretch>
-                      <a:fillRect/>
-                    </a:stretch>
-                  </pic:blipFill>
-                  <pic:spPr>
-                    <a:xfrm>
-                      <a:off x="0" y="0"/>
-                      <a:ext cx="5760000" cy="810000"/>
-                    </a:xfrm>
-                    <a:prstGeom prst="rect"/>
-                  </pic:spPr>
-                </pic:pic>
-              </a:graphicData>
-            </a:graphic>
-          </wp:inline>
-        </w:drawing>
-      </w:r>
-    </w:p>
-    <w:p>
-      <w:pPr>
-        <w:spacing w:after="200"/>
-        <w:jc w:val="center"/>
-      </w:pPr>
-      <w:r>
-        <w:rPr>
-          <w:rFonts w:ascii="Times New Roman" w:hAnsi="Times New Roman"/>
-          <w:b w:val="0"/>
-          <w:i w:val="0"/>
-          <w:u w:val="none"/>
-        </w:rPr>
-        <w:t>Рис. 3а. PulseView: `Address write: 69` завершується `NACK`, далі `P` – пристрій з такою адресою відсутній</w:t>
-      </w:r>
-    </w:p>
-    <w:p>
-      <w:pPr>
-        <w:spacing w:after="120"/>
-        <w:jc w:val="both"/>
-      </w:pPr>
-      <w:r>
-        <w:rPr>
-          <w:rFonts w:ascii="Times New Roman" w:hAnsi="Times New Roman"/>
-          <w:b w:val="0"/>
-          <w:i w:val="0"/>
-          <w:u w:val="none"/>
-        </w:rPr>
-        <w:t xml:space="preserve">Аномалії: (1) адреса 0x69 (AD0 = VCC) – NACK на дев'ятому такті, SDA лишається високою; драйвер розрізняє </w:t>
-      </w:r>
-      <w:r>
-        <w:rPr>
-          <w:rFonts w:ascii="Courier New" w:hAnsi="Courier New" w:eastAsia="Courier New"/>
-          <w:b w:val="0"/>
-          <w:i w:val="0"/>
-          <w:sz w:val="24"/>
-          <w:u w:val="none"/>
-        </w:rPr>
-        <w:t>NACK</w:t>
-      </w:r>
-      <w:r>
-        <w:rPr>
-          <w:rFonts w:ascii="Times New Roman" w:hAnsi="Times New Roman"/>
-          <w:b w:val="0"/>
-          <w:i w:val="0"/>
-          <w:u w:val="none"/>
-        </w:rPr>
-        <w:t xml:space="preserve"> і </w:t>
-      </w:r>
-      <w:r>
-        <w:rPr>
-          <w:rFonts w:ascii="Courier New" w:hAnsi="Courier New" w:eastAsia="Courier New"/>
-          <w:b w:val="0"/>
-          <w:i w:val="0"/>
-          <w:sz w:val="24"/>
-          <w:u w:val="none"/>
-        </w:rPr>
-        <w:t>TIMEOUT</w:t>
-      </w:r>
-      <w:r>
-        <w:rPr>
-          <w:rFonts w:ascii="Times New Roman" w:hAnsi="Times New Roman"/>
-          <w:b w:val="0"/>
-          <w:i w:val="0"/>
-          <w:u w:val="none"/>
-        </w:rPr>
-        <w:t xml:space="preserve">. (2) Між записом адреси регістра і читанням є STOP, а не повторний START (обхід моделі I2C у Wokwi); реальний чіп це приймає, але на залізі слід увімкнути </w:t>
-      </w:r>
-      <w:r>
-        <w:rPr>
-          <w:rFonts w:ascii="Courier New" w:hAnsi="Courier New" w:eastAsia="Courier New"/>
-          <w:b w:val="0"/>
-          <w:i w:val="0"/>
-          <w:sz w:val="24"/>
-          <w:u w:val="none"/>
-        </w:rPr>
-        <w:t>BOARD_I2C_REPEATED_START</w:t>
-      </w:r>
-      <w:r>
-        <w:rPr>
-          <w:rFonts w:ascii="Times New Roman" w:hAnsi="Times New Roman"/>
-          <w:b w:val="0"/>
-          <w:i w:val="0"/>
-          <w:u w:val="none"/>
-        </w:rPr>
-        <w:t>.</w:t>
-      </w:r>
-    </w:p>
-    <w:p>
-      <w:pPr>
-        <w:keepNext/>
-        <w:spacing w:after="120"/>
-        <w:jc w:val="left"/>
-      </w:pPr>
-      <w:r>
-        <w:rPr>
-          <w:rFonts w:ascii="Times New Roman" w:hAnsi="Times New Roman"/>
-          <w:b/>
-          <w:i w:val="0"/>
-          <w:u w:val="none"/>
-        </w:rPr>
-        <w:t>4.2 SPI</w:t>
-      </w:r>
-    </w:p>
-    <w:p>
-      <w:pPr>
-        <w:keepNext/>
-        <w:spacing w:before="120"/>
-        <w:jc w:val="center"/>
-      </w:pPr>
-      <w:r>
-        <w:drawing>
-          <wp:inline xmlns:a="http://schemas.openxmlformats.org/drawingml/2006/main" xmlns:pic="http://schemas.openxmlformats.org/drawingml/2006/picture">
-            <wp:extent cx="5760000" cy="2126769"/>
-            <wp:docPr id="8" name="Picture 8"/>
-            <wp:cNvGraphicFramePr>
-              <a:graphicFrameLocks noChangeAspect="1"/>
-            </wp:cNvGraphicFramePr>
-            <a:graphic>
-              <a:graphicData uri="http://schemas.openxmlformats.org/drawingml/2006/picture">
-                <pic:pic>
-                  <pic:nvPicPr>
-                    <pic:cNvPr id="0" name="spi_jedec.png"/>
-                    <pic:cNvPicPr/>
-                  </pic:nvPicPr>
-                  <pic:blipFill>
-                    <a:blip r:embed="rId16"/>
-                    <a:stretch>
-                      <a:fillRect/>
-                    </a:stretch>
-                  </pic:blipFill>
-                  <pic:spPr>
-                    <a:xfrm>
-                      <a:off x="0" y="0"/>
-                      <a:ext cx="5760000" cy="2126769"/>
-                    </a:xfrm>
-                    <a:prstGeom prst="rect"/>
-                  </pic:spPr>
-                </pic:pic>
-              </a:graphicData>
-            </a:graphic>
-          </wp:inline>
-        </w:drawing>
-      </w:r>
-    </w:p>
-    <w:p>
-      <w:pPr>
-        <w:spacing w:after="200"/>
-        <w:jc w:val="center"/>
-      </w:pPr>
-      <w:r>
-        <w:rPr>
-          <w:rFonts w:ascii="Times New Roman" w:hAnsi="Times New Roman"/>
-          <w:b w:val="0"/>
-          <w:i w:val="0"/>
-          <w:u w:val="none"/>
-        </w:rPr>
-        <w:t>Рис. 4. SPI1: команда JEDEC ID (0x9F), відповідь EF 40 17</w:t>
-      </w:r>
-    </w:p>
-    <w:p>
-      <w:pPr>
-        <w:keepNext/>
-        <w:spacing w:before="120"/>
-        <w:jc w:val="center"/>
-      </w:pPr>
-      <w:r>
-        <w:drawing>
-          <wp:inline xmlns:a="http://schemas.openxmlformats.org/drawingml/2006/main" xmlns:pic="http://schemas.openxmlformats.org/drawingml/2006/picture">
-            <wp:extent cx="5760000" cy="2016000"/>
-            <wp:docPr id="9" name="Picture 9"/>
-            <wp:cNvGraphicFramePr>
-              <a:graphicFrameLocks noChangeAspect="1"/>
-            </wp:cNvGraphicFramePr>
-            <a:graphic>
-              <a:graphicData uri="http://schemas.openxmlformats.org/drawingml/2006/picture">
-                <pic:pic>
-                  <pic:nvPicPr>
-                    <pic:cNvPr id="0" name="spi_byte.png"/>
-                    <pic:cNvPicPr/>
-                  </pic:nvPicPr>
-                  <pic:blipFill>
-                    <a:blip r:embed="rId17"/>
-                    <a:stretch>
-                      <a:fillRect/>
-                    </a:stretch>
-                  </pic:blipFill>
-                  <pic:spPr>
-                    <a:xfrm>
-                      <a:off x="0" y="0"/>
-                      <a:ext cx="5760000" cy="2016000"/>
-                    </a:xfrm>
-                    <a:prstGeom prst="rect"/>
-                  </pic:spPr>
-                </pic:pic>
-              </a:graphicData>
-            </a:graphic>
-          </wp:inline>
-        </w:drawing>
-      </w:r>
-    </w:p>
-    <w:p>
-      <w:pPr>
-        <w:spacing w:after="200"/>
-        <w:jc w:val="center"/>
-      </w:pPr>
-      <w:r>
-        <w:rPr>
-          <w:rFonts w:ascii="Times New Roman" w:hAnsi="Times New Roman"/>
-          <w:b w:val="0"/>
-          <w:i w:val="0"/>
-          <w:u w:val="none"/>
-        </w:rPr>
-        <w:t>Рис. 5. Перший байт команди: біти MOSI у моменти наростаючого фронту SCK</w:t>
-      </w:r>
-    </w:p>
-    <w:p>
-      <w:pPr>
-        <w:keepNext/>
-        <w:spacing w:before="120"/>
-        <w:jc w:val="center"/>
-      </w:pPr>
-      <w:r>
-        <w:drawing>
-          <wp:inline xmlns:a="http://schemas.openxmlformats.org/drawingml/2006/main" xmlns:pic="http://schemas.openxmlformats.org/drawingml/2006/picture">
-            <wp:extent cx="5760000" cy="1350000"/>
-            <wp:docPr id="10" name="Picture 10"/>
             <wp:cNvGraphicFramePr>
               <a:graphicFrameLocks noChangeAspect="1"/>
             </wp:cNvGraphicFramePr>
@@ -3421,7 +3141,7 @@
                     <pic:cNvPicPr/>
                   </pic:nvPicPr>
                   <pic:blipFill>
-                    <a:blip r:embed="rId18"/>
+                    <a:blip r:embed="rId13"/>
                     <a:stretch>
                       <a:fillRect/>
                     </a:stretch>
@@ -3452,7 +3172,7 @@
           <w:i w:val="0"/>
           <w:u w:val="none"/>
         </w:rPr>
-        <w:t>Рис. 4а. PulseView, декодери SPI (CLK = D2, MOSI = D3, MISO = D4, CS = D5) і SPI flash: MOSI `9F FF FF FF`, MISO `7F EF 40 17`, команда `Read identification (RDID)`. Назву виробника в підписі декодера (`Adesto`) PulseView бере з власної таблиці; ідентифікатор EF 40 17 відповідає Winbond W25Q64JV за datasheet</w:t>
+        <w:t>Рис. 5. PulseView, декодери SPI (CLK = D2, MOSI = D3, MISO = D4, CS = D5) і SPI flash: MOSI `9F FF FF FF`, MISO `7F EF 40 17`, команда `Read identification (RDID)`. Назву виробника в підписі декодера (`Adesto`) PulseView бере з власної таблиці; ідентифікатор EF 40 17 відповідає Winbond W25Q64JV за datasheet</w:t>
       </w:r>
     </w:p>
     <w:p>
@@ -3465,7 +3185,7 @@
         <w:drawing>
           <wp:inline xmlns:a="http://schemas.openxmlformats.org/drawingml/2006/main" xmlns:pic="http://schemas.openxmlformats.org/drawingml/2006/picture">
             <wp:extent cx="5760000" cy="1350000"/>
-            <wp:docPr id="11" name="Picture 11"/>
+            <wp:docPr id="6" name="Picture 6"/>
             <wp:cNvGraphicFramePr>
               <a:graphicFrameLocks noChangeAspect="1"/>
             </wp:cNvGraphicFramePr>
@@ -3477,7 +3197,7 @@
                     <pic:cNvPicPr/>
                   </pic:nvPicPr>
                   <pic:blipFill>
-                    <a:blip r:embed="rId19"/>
+                    <a:blip r:embed="rId14"/>
                     <a:stretch>
                       <a:fillRect/>
                     </a:stretch>
@@ -3508,7 +3228,7 @@
           <w:i w:val="0"/>
           <w:u w:val="none"/>
         </w:rPr>
-        <w:t>Рис. 4б. PulseView: запис і читання сторінки – `WREN`, `RDSR` (опитування WIP), `Page program (addr 0x0010F8)`, `Read data (addr 0x0010F8, 16 bytes)`</w:t>
+        <w:t>Рис. 6. PulseView: запис і читання сторінки – `WREN`, `RDSR` (опитування WIP), `Page program (addr 0x0010F8)`, `Read data (addr 0x0010F8, 16 bytes)`</w:t>
       </w:r>
     </w:p>
     <w:p>
@@ -3521,7 +3241,7 @@
         <w:drawing>
           <wp:inline xmlns:a="http://schemas.openxmlformats.org/drawingml/2006/main" xmlns:pic="http://schemas.openxmlformats.org/drawingml/2006/picture">
             <wp:extent cx="5760000" cy="1290000"/>
-            <wp:docPr id="12" name="Picture 12"/>
+            <wp:docPr id="7" name="Picture 7"/>
             <wp:cNvGraphicFramePr>
               <a:graphicFrameLocks noChangeAspect="1"/>
             </wp:cNvGraphicFramePr>
@@ -3533,7 +3253,7 @@
                     <pic:cNvPicPr/>
                   </pic:nvPicPr>
                   <pic:blipFill>
-                    <a:blip r:embed="rId20"/>
+                    <a:blip r:embed="rId15"/>
                     <a:stretch>
                       <a:fillRect/>
                     </a:stretch>
@@ -3564,7 +3284,7 @@
           <w:i w:val="0"/>
           <w:u w:val="none"/>
         </w:rPr>
-        <w:t>Рис. 4в. PulseView, аномалія SPI mode 3: декодер mode 0 бачить `CF FF FF FF` і `Unknown command: 0xff` замість `9F`</w:t>
+        <w:t>Рис. 7. PulseView, аномалія SPI mode 3: декодер mode 0 бачить `CF FF FF FF` і `Unknown command: 0xff` замість `9F`</w:t>
       </w:r>
     </w:p>
     <w:p>
@@ -3598,7 +3318,7 @@
           <w:i w:val="0"/>
           <w:u w:val="none"/>
         </w:rPr>
-        <w:t xml:space="preserve"> – збігається з W25Q64JV. Режим 0 (CPOL = 0, CPHA = 0): SCK у спокої низький, дані стабільні на наростаючому фронті (рис. 5). CS# утримується низьким усю команду. Виміряно: SCK 3.08 МГц (розрахунок 3 МГц), CS низький 240.75 мкс, CS↓ → перший фронт SCK 24.98 мкс, пауза 99.4 мкс між командою і відповіддю (два окремі виклики HAL).</w:t>
+        <w:t xml:space="preserve"> – збігається з W25Q64JV. Режим 0 (CPOL = 0, CPHA = 0): SCK у спокої низький, дані стабільні на наростаючому фронті. CS# утримується низьким усю команду. Виміряно: SCK 3.08 МГц (розрахунок 3 МГц), CS низький 240.75 мкс, CS↓ → перший фронт SCK 24.98 мкс, пауза 99.4 мкс між командою і відповіддю (два окремі виклики HAL).</w:t>
       </w:r>
     </w:p>
     <w:p>
@@ -3732,64 +3452,8 @@
       <w:r>
         <w:drawing>
           <wp:inline xmlns:a="http://schemas.openxmlformats.org/drawingml/2006/main" xmlns:pic="http://schemas.openxmlformats.org/drawingml/2006/picture">
-            <wp:extent cx="5760000" cy="864000"/>
-            <wp:docPr id="13" name="Picture 13"/>
-            <wp:cNvGraphicFramePr>
-              <a:graphicFrameLocks noChangeAspect="1"/>
-            </wp:cNvGraphicFramePr>
-            <a:graphic>
-              <a:graphicData uri="http://schemas.openxmlformats.org/drawingml/2006/picture">
-                <pic:pic>
-                  <pic:nvPicPr>
-                    <pic:cNvPr id="0" name="uart_bits.png"/>
-                    <pic:cNvPicPr/>
-                  </pic:nvPicPr>
-                  <pic:blipFill>
-                    <a:blip r:embed="rId21"/>
-                    <a:stretch>
-                      <a:fillRect/>
-                    </a:stretch>
-                  </pic:blipFill>
-                  <pic:spPr>
-                    <a:xfrm>
-                      <a:off x="0" y="0"/>
-                      <a:ext cx="5760000" cy="864000"/>
-                    </a:xfrm>
-                    <a:prstGeom prst="rect"/>
-                  </pic:spPr>
-                </pic:pic>
-              </a:graphicData>
-            </a:graphic>
-          </wp:inline>
-        </w:drawing>
-      </w:r>
-    </w:p>
-    <w:p>
-      <w:pPr>
-        <w:spacing w:after="200"/>
-        <w:jc w:val="center"/>
-      </w:pPr>
-      <w:r>
-        <w:rPr>
-          <w:rFonts w:ascii="Times New Roman" w:hAnsi="Times New Roman"/>
-          <w:b w:val="0"/>
-          <w:i w:val="0"/>
-          <w:u w:val="none"/>
-        </w:rPr>
-        <w:t>Рис. 6. USART2: перші символи банера</w:t>
-      </w:r>
-    </w:p>
-    <w:p>
-      <w:pPr>
-        <w:keepNext/>
-        <w:spacing w:before="120"/>
-        <w:jc w:val="center"/>
-      </w:pPr>
-      <w:r>
-        <w:drawing>
-          <wp:inline xmlns:a="http://schemas.openxmlformats.org/drawingml/2006/main" xmlns:pic="http://schemas.openxmlformats.org/drawingml/2006/picture">
             <wp:extent cx="5760000" cy="780000"/>
-            <wp:docPr id="14" name="Picture 14"/>
+            <wp:docPr id="8" name="Picture 8"/>
             <wp:cNvGraphicFramePr>
               <a:graphicFrameLocks noChangeAspect="1"/>
             </wp:cNvGraphicFramePr>
@@ -3801,7 +3465,7 @@
                     <pic:cNvPicPr/>
                   </pic:nvPicPr>
                   <pic:blipFill>
-                    <a:blip r:embed="rId22"/>
+                    <a:blip r:embed="rId16"/>
                     <a:stretch>
                       <a:fillRect/>
                     </a:stretch>
@@ -3832,7 +3496,7 @@
           <w:i w:val="0"/>
           <w:u w:val="none"/>
         </w:rPr>
-        <w:t>Рис. 6а. PulseView, декодер UART (RX = D6, 115200 8N1): байти `0D 0A 68 65 6C 6C 6F 20 66 72 6F 6D 20 53 54 4D 33 32 20 28 6C 72 32 29 0D 0A` = `hello from STM32 (lr2)`</w:t>
+        <w:t>Рис. 8. PulseView, декодер UART (RX = D6, 115200 8N1): байти `0D 0A 68 65 6C 6C 6F 20 66 72 6F 6D 20 53 54 4D 33 32 20 28 6C 72 32 29 0D 0A` = `hello from STM32 (lr2)`</w:t>
       </w:r>
     </w:p>
     <w:p>
@@ -3913,64 +3577,8 @@
       <w:r>
         <w:drawing>
           <wp:inline xmlns:a="http://schemas.openxmlformats.org/drawingml/2006/main" xmlns:pic="http://schemas.openxmlformats.org/drawingml/2006/picture">
-            <wp:extent cx="5760000" cy="2304000"/>
-            <wp:docPr id="15" name="Picture 15"/>
-            <wp:cNvGraphicFramePr>
-              <a:graphicFrameLocks noChangeAspect="1"/>
-            </wp:cNvGraphicFramePr>
-            <a:graphic>
-              <a:graphicData uri="http://schemas.openxmlformats.org/drawingml/2006/picture">
-                <pic:pic>
-                  <pic:nvPicPr>
-                    <pic:cNvPr id="0" name="pwm_widths.png"/>
-                    <pic:cNvPicPr/>
-                  </pic:nvPicPr>
-                  <pic:blipFill>
-                    <a:blip r:embed="rId23"/>
-                    <a:stretch>
-                      <a:fillRect/>
-                    </a:stretch>
-                  </pic:blipFill>
-                  <pic:spPr>
-                    <a:xfrm>
-                      <a:off x="0" y="0"/>
-                      <a:ext cx="5760000" cy="2304000"/>
-                    </a:xfrm>
-                    <a:prstGeom prst="rect"/>
-                  </pic:spPr>
-                </pic:pic>
-              </a:graphicData>
-            </a:graphic>
-          </wp:inline>
-        </w:drawing>
-      </w:r>
-    </w:p>
-    <w:p>
-      <w:pPr>
-        <w:spacing w:after="200"/>
-        <w:jc w:val="center"/>
-      </w:pPr>
-      <w:r>
-        <w:rPr>
-          <w:rFonts w:ascii="Times New Roman" w:hAnsi="Times New Roman"/>
-          <w:b w:val="0"/>
-          <w:i w:val="0"/>
-          <w:u w:val="none"/>
-        </w:rPr>
-        <w:t>Рис. 7. TIM3 CH1: ширини 1000 / 1500 / 2000 мкс, період 20 мс</w:t>
-      </w:r>
-    </w:p>
-    <w:p>
-      <w:pPr>
-        <w:keepNext/>
-        <w:spacing w:before="120"/>
-        <w:jc w:val="center"/>
-      </w:pPr>
-      <w:r>
-        <w:drawing>
-          <wp:inline xmlns:a="http://schemas.openxmlformats.org/drawingml/2006/main" xmlns:pic="http://schemas.openxmlformats.org/drawingml/2006/picture">
             <wp:extent cx="5760000" cy="690000"/>
-            <wp:docPr id="16" name="Picture 16"/>
+            <wp:docPr id="9" name="Picture 9"/>
             <wp:cNvGraphicFramePr>
               <a:graphicFrameLocks noChangeAspect="1"/>
             </wp:cNvGraphicFramePr>
@@ -3982,7 +3590,7 @@
                     <pic:cNvPicPr/>
                   </pic:nvPicPr>
                   <pic:blipFill>
-                    <a:blip r:embed="rId24"/>
+                    <a:blip r:embed="rId17"/>
                     <a:stretch>
                       <a:fillRect/>
                     </a:stretch>
@@ -4013,7 +3621,7 @@
           <w:i w:val="0"/>
           <w:u w:val="none"/>
         </w:rPr>
-        <w:t>Рис. 7а. PulseView, декодер PWM (D7): період 20.0 мс, duty cycle 5 % → 10 % → 7.5 % (1000, 2000, 1500 мкс)</w:t>
+        <w:t>Рис. 9. PulseView, декодер PWM (D7): період 20.0 мс, duty cycle 5 % → 10 % → 7.5 % (1000, 2000, 1500 мкс)</w:t>
       </w:r>
     </w:p>
     <w:p>
@@ -4057,7 +3665,7 @@
         <w:drawing>
           <wp:inline xmlns:a="http://schemas.openxmlformats.org/drawingml/2006/main" xmlns:pic="http://schemas.openxmlformats.org/drawingml/2006/picture">
             <wp:extent cx="5760000" cy="1705846"/>
-            <wp:docPr id="17" name="Picture 17"/>
+            <wp:docPr id="10" name="Picture 10"/>
             <wp:cNvGraphicFramePr>
               <a:graphicFrameLocks noChangeAspect="1"/>
             </wp:cNvGraphicFramePr>
@@ -4069,7 +3677,7 @@
                     <pic:cNvPicPr/>
                   </pic:nvPicPr>
                   <pic:blipFill>
-                    <a:blip r:embed="rId25"/>
+                    <a:blip r:embed="rId18"/>
                     <a:stretch>
                       <a:fillRect/>
                     </a:stretch>
@@ -4100,7 +3708,7 @@
           <w:i w:val="0"/>
           <w:u w:val="none"/>
         </w:rPr>
-        <w:t>Рис. 8. Маркер PB1: тривалість вимірювання і затримка до I2C</w:t>
+        <w:t>Рис. 10. Маркер PB1: тривалість вимірювання і затримка до I2C</w:t>
       </w:r>
     </w:p>
     <w:p>
@@ -4744,7 +4352,7 @@
         <w:drawing>
           <wp:inline xmlns:a="http://schemas.openxmlformats.org/drawingml/2006/main" xmlns:pic="http://schemas.openxmlformats.org/drawingml/2006/picture">
             <wp:extent cx="5760000" cy="3456000"/>
-            <wp:docPr id="18" name="Picture 18"/>
+            <wp:docPr id="11" name="Picture 11"/>
             <wp:cNvGraphicFramePr>
               <a:graphicFrameLocks noChangeAspect="1"/>
             </wp:cNvGraphicFramePr>
@@ -4756,7 +4364,7 @@
                     <pic:cNvPicPr/>
                   </pic:nvPicPr>
                   <pic:blipFill>
-                    <a:blip r:embed="rId26"/>
+                    <a:blip r:embed="rId19"/>
                     <a:stretch>
                       <a:fillRect/>
                     </a:stretch>
@@ -4787,7 +4395,7 @@
           <w:i w:val="0"/>
           <w:u w:val="none"/>
         </w:rPr>
-        <w:t>Рис. 9. Component diagram: шари Core, App, Platform, Devices, Drivers, хостові тести і напрямок залежностей</w:t>
+        <w:t>Рис. 11. Component diagram: шари Core, App, Platform, Devices, Drivers, хостові тести і напрямок залежностей</w:t>
       </w:r>
     </w:p>
     <w:p>
@@ -5634,7 +5242,7 @@
         </w:rPr>
         <w:t xml:space="preserve">; виправлено у </w:t>
       </w:r>
-      <w:hyperlink r:id="rId27">
+      <w:hyperlink r:id="rId20">
         <w:r>
           <w:rPr>
             <w:color w:val="0563C1"/>
@@ -5725,7 +5333,7 @@
         </w:rPr>
         <w:t xml:space="preserve">, </w:t>
       </w:r>
-      <w:hyperlink r:id="rId27">
+      <w:hyperlink r:id="rId20">
         <w:r>
           <w:rPr>
             <w:color w:val="0563C1"/>
@@ -5865,7 +5473,7 @@
         </w:rPr>
         <w:t xml:space="preserve">, коміт </w:t>
       </w:r>
-      <w:hyperlink r:id="rId28">
+      <w:hyperlink r:id="rId21">
         <w:r>
           <w:rPr>
             <w:color w:val="0563C1"/>
@@ -5989,7 +5597,7 @@
         </w:rPr>
         <w:t xml:space="preserve">, </w:t>
       </w:r>
-      <w:hyperlink r:id="rId29">
+      <w:hyperlink r:id="rId22">
         <w:r>
           <w:rPr>
             <w:color w:val="0563C1"/>
@@ -6094,7 +5702,7 @@
         </w:rPr>
         <w:t xml:space="preserve"> для залізної збірки, </w:t>
       </w:r>
-      <w:hyperlink r:id="rId27">
+      <w:hyperlink r:id="rId20">
         <w:r>
           <w:rPr>
             <w:color w:val="0563C1"/>
@@ -6180,7 +5788,7 @@
         </w:rPr>
         <w:t xml:space="preserve">), відновлення після таймауту перемиканням PE, </w:t>
       </w:r>
-      <w:hyperlink r:id="rId27">
+      <w:hyperlink r:id="rId20">
         <w:r>
           <w:rPr>
             <w:color w:val="0563C1"/>
@@ -6285,7 +5893,7 @@
         </w:rPr>
         <w:t xml:space="preserve">), </w:t>
       </w:r>
-      <w:hyperlink r:id="rId30">
+      <w:hyperlink r:id="rId23">
         <w:r>
           <w:rPr>
             <w:color w:val="0563C1"/>
@@ -6390,7 +5998,7 @@
         </w:rPr>
         <w:t xml:space="preserve"> відтворює всі декодування, </w:t>
       </w:r>
-      <w:hyperlink r:id="rId31">
+      <w:hyperlink r:id="rId24">
         <w:r>
           <w:rPr>
             <w:color w:val="0563C1"/>
@@ -6552,7 +6160,7 @@
         </w:rPr>
         <w:t xml:space="preserve"> → raw = 300 (242 мВ), що збігається з 75/1023 · 3.3 В, </w:t>
       </w:r>
-      <w:hyperlink r:id="rId32">
+      <w:hyperlink r:id="rId25">
         <w:r>
           <w:rPr>
             <w:color w:val="0563C1"/>
@@ -6752,7 +6360,7 @@
         </w:rPr>
         <w:t xml:space="preserve">, </w:t>
       </w:r>
-      <w:hyperlink r:id="rId28">
+      <w:hyperlink r:id="rId21">
         <w:r>
           <w:rPr>
             <w:color w:val="0563C1"/>
@@ -8777,7 +8385,7 @@
           <w:i w:val="0"/>
           <w:u w:val="none"/>
         </w:rPr>
-        <w:t xml:space="preserve"> CPOL – рівень SCK у спокої, CPHA – по якому фронту вибираються дані (перший чи другий). Flash W25Q64 використовує mode 0 (CPOL = 0, CPHA = 0; підтримує також mode 3). Підтверджено записом: SCK у спокої низький, біти MOSI стабільні на наростаючому фронті (рис. 5), JEDEC EF 40 17 декодується в mode 0, а при CPOL = 1, CPHA = 1 декодер бачить </w:t>
+        <w:t xml:space="preserve"> CPOL – рівень SCK у спокої, CPHA – по якому фронту вибираються дані (перший чи другий). Flash W25Q64 використовує mode 0 (CPOL = 0, CPHA = 0; підтримує також mode 3). Підтверджено записом: SCK у спокої низький, біти MOSI стабільні на наростаючому фронті, JEDEC EF 40 17 декодується в mode 0, а при CPOL = 1, CPHA = 1 декодер бачить </w:t>
       </w:r>
       <w:r>
         <w:rPr>
@@ -9500,7 +9108,7 @@
         <w:drawing>
           <wp:inline xmlns:a="http://schemas.openxmlformats.org/drawingml/2006/main" xmlns:pic="http://schemas.openxmlformats.org/drawingml/2006/picture">
             <wp:extent cx="5760000" cy="3244557"/>
-            <wp:docPr id="19" name="Picture 19"/>
+            <wp:docPr id="12" name="Picture 12"/>
             <wp:cNvGraphicFramePr>
               <a:graphicFrameLocks noChangeAspect="1"/>
             </wp:cNvGraphicFramePr>
@@ -9512,7 +9120,7 @@
                     <pic:cNvPicPr/>
                   </pic:nvPicPr>
                   <pic:blipFill>
-                    <a:blip r:embed="rId33"/>
+                    <a:blip r:embed="rId26"/>
                     <a:stretch>
                       <a:fillRect/>
                     </a:stretch>
@@ -9556,7 +9164,7 @@
         <w:drawing>
           <wp:inline xmlns:a="http://schemas.openxmlformats.org/drawingml/2006/main" xmlns:pic="http://schemas.openxmlformats.org/drawingml/2006/picture">
             <wp:extent cx="5760000" cy="3481519"/>
-            <wp:docPr id="20" name="Picture 20"/>
+            <wp:docPr id="13" name="Picture 13"/>
             <wp:cNvGraphicFramePr>
               <a:graphicFrameLocks noChangeAspect="1"/>
             </wp:cNvGraphicFramePr>
@@ -9568,7 +9176,7 @@
                     <pic:cNvPicPr/>
                   </pic:nvPicPr>
                   <pic:blipFill>
-                    <a:blip r:embed="rId34"/>
+                    <a:blip r:embed="rId27"/>
                     <a:stretch>
                       <a:fillRect/>
                     </a:stretch>
@@ -9612,7 +9220,7 @@
         <w:drawing>
           <wp:inline xmlns:a="http://schemas.openxmlformats.org/drawingml/2006/main" xmlns:pic="http://schemas.openxmlformats.org/drawingml/2006/picture">
             <wp:extent cx="5760000" cy="3090000"/>
-            <wp:docPr id="21" name="Picture 21"/>
+            <wp:docPr id="14" name="Picture 14"/>
             <wp:cNvGraphicFramePr>
               <a:graphicFrameLocks noChangeAspect="1"/>
             </wp:cNvGraphicFramePr>
@@ -9624,7 +9232,7 @@
                     <pic:cNvPicPr/>
                   </pic:nvPicPr>
                   <pic:blipFill>
-                    <a:blip r:embed="rId35"/>
+                    <a:blip r:embed="rId28"/>
                     <a:stretch>
                       <a:fillRect/>
                     </a:stretch>
@@ -9668,7 +9276,7 @@
         <w:drawing>
           <wp:inline xmlns:a="http://schemas.openxmlformats.org/drawingml/2006/main" xmlns:pic="http://schemas.openxmlformats.org/drawingml/2006/picture">
             <wp:extent cx="5760000" cy="3090000"/>
-            <wp:docPr id="22" name="Picture 22"/>
+            <wp:docPr id="15" name="Picture 15"/>
             <wp:cNvGraphicFramePr>
               <a:graphicFrameLocks noChangeAspect="1"/>
             </wp:cNvGraphicFramePr>
@@ -9680,7 +9288,7 @@
                     <pic:cNvPicPr/>
                   </pic:nvPicPr>
                   <pic:blipFill>
-                    <a:blip r:embed="rId36"/>
+                    <a:blip r:embed="rId29"/>
                     <a:stretch>
                       <a:fillRect/>
                     </a:stretch>
@@ -9724,7 +9332,7 @@
         <w:drawing>
           <wp:inline xmlns:a="http://schemas.openxmlformats.org/drawingml/2006/main" xmlns:pic="http://schemas.openxmlformats.org/drawingml/2006/picture">
             <wp:extent cx="5760000" cy="3090000"/>
-            <wp:docPr id="23" name="Picture 23"/>
+            <wp:docPr id="16" name="Picture 16"/>
             <wp:cNvGraphicFramePr>
               <a:graphicFrameLocks noChangeAspect="1"/>
             </wp:cNvGraphicFramePr>
@@ -9736,7 +9344,7 @@
                     <pic:cNvPicPr/>
                   </pic:nvPicPr>
                   <pic:blipFill>
-                    <a:blip r:embed="rId37"/>
+                    <a:blip r:embed="rId30"/>
                     <a:stretch>
                       <a:fillRect/>
                     </a:stretch>
@@ -9780,7 +9388,7 @@
         <w:drawing>
           <wp:inline xmlns:a="http://schemas.openxmlformats.org/drawingml/2006/main" xmlns:pic="http://schemas.openxmlformats.org/drawingml/2006/picture">
             <wp:extent cx="5760000" cy="3090000"/>
-            <wp:docPr id="24" name="Picture 24"/>
+            <wp:docPr id="17" name="Picture 17"/>
             <wp:cNvGraphicFramePr>
               <a:graphicFrameLocks noChangeAspect="1"/>
             </wp:cNvGraphicFramePr>
@@ -9792,7 +9400,7 @@
                     <pic:cNvPicPr/>
                   </pic:nvPicPr>
                   <pic:blipFill>
-                    <a:blip r:embed="rId38"/>
+                    <a:blip r:embed="rId31"/>
                     <a:stretch>
                       <a:fillRect/>
                     </a:stretch>
@@ -9836,7 +9444,7 @@
         <w:drawing>
           <wp:inline xmlns:a="http://schemas.openxmlformats.org/drawingml/2006/main" xmlns:pic="http://schemas.openxmlformats.org/drawingml/2006/picture">
             <wp:extent cx="5760000" cy="5524645"/>
-            <wp:docPr id="25" name="Picture 25"/>
+            <wp:docPr id="18" name="Picture 18"/>
             <wp:cNvGraphicFramePr>
               <a:graphicFrameLocks noChangeAspect="1"/>
             </wp:cNvGraphicFramePr>
@@ -9848,7 +9456,7 @@
                     <pic:cNvPicPr/>
                   </pic:nvPicPr>
                   <pic:blipFill>
-                    <a:blip r:embed="rId39"/>
+                    <a:blip r:embed="rId32"/>
                     <a:stretch>
                       <a:fillRect/>
                     </a:stretch>
@@ -9892,7 +9500,7 @@
         <w:drawing>
           <wp:inline xmlns:a="http://schemas.openxmlformats.org/drawingml/2006/main" xmlns:pic="http://schemas.openxmlformats.org/drawingml/2006/picture">
             <wp:extent cx="4836233" cy="7559999"/>
-            <wp:docPr id="26" name="Picture 26"/>
+            <wp:docPr id="19" name="Picture 19"/>
             <wp:cNvGraphicFramePr>
               <a:graphicFrameLocks noChangeAspect="1"/>
             </wp:cNvGraphicFramePr>
@@ -9904,7 +9512,7 @@
                     <pic:cNvPicPr/>
                   </pic:nvPicPr>
                   <pic:blipFill>
-                    <a:blip r:embed="rId40"/>
+                    <a:blip r:embed="rId33"/>
                     <a:stretch>
                       <a:fillRect/>
                     </a:stretch>
@@ -9948,7 +9556,7 @@
         <w:drawing>
           <wp:inline xmlns:a="http://schemas.openxmlformats.org/drawingml/2006/main" xmlns:pic="http://schemas.openxmlformats.org/drawingml/2006/picture">
             <wp:extent cx="5760000" cy="4206316"/>
-            <wp:docPr id="27" name="Picture 27"/>
+            <wp:docPr id="20" name="Picture 20"/>
             <wp:cNvGraphicFramePr>
               <a:graphicFrameLocks noChangeAspect="1"/>
             </wp:cNvGraphicFramePr>
@@ -9960,7 +9568,7 @@
                     <pic:cNvPicPr/>
                   </pic:nvPicPr>
                   <pic:blipFill>
-                    <a:blip r:embed="rId41"/>
+                    <a:blip r:embed="rId34"/>
                     <a:stretch>
                       <a:fillRect/>
                     </a:stretch>
@@ -10004,7 +9612,7 @@
         <w:drawing>
           <wp:inline xmlns:a="http://schemas.openxmlformats.org/drawingml/2006/main" xmlns:pic="http://schemas.openxmlformats.org/drawingml/2006/picture">
             <wp:extent cx="5760000" cy="1810286"/>
-            <wp:docPr id="28" name="Picture 28"/>
+            <wp:docPr id="21" name="Picture 21"/>
             <wp:cNvGraphicFramePr>
               <a:graphicFrameLocks noChangeAspect="1"/>
             </wp:cNvGraphicFramePr>
@@ -10016,7 +9624,7 @@
                     <pic:cNvPicPr/>
                   </pic:nvPicPr>
                   <pic:blipFill>
-                    <a:blip r:embed="rId42"/>
+                    <a:blip r:embed="rId35"/>
                     <a:stretch>
                       <a:fillRect/>
                     </a:stretch>
@@ -10060,7 +9668,7 @@
         <w:drawing>
           <wp:inline xmlns:a="http://schemas.openxmlformats.org/drawingml/2006/main" xmlns:pic="http://schemas.openxmlformats.org/drawingml/2006/picture">
             <wp:extent cx="5760000" cy="3276000"/>
-            <wp:docPr id="29" name="Picture 29"/>
+            <wp:docPr id="22" name="Picture 22"/>
             <wp:cNvGraphicFramePr>
               <a:graphicFrameLocks noChangeAspect="1"/>
             </wp:cNvGraphicFramePr>
@@ -10072,7 +9680,7 @@
                     <pic:cNvPicPr/>
                   </pic:nvPicPr>
                   <pic:blipFill>
-                    <a:blip r:embed="rId43"/>
+                    <a:blip r:embed="rId36"/>
                     <a:stretch>
                       <a:fillRect/>
                     </a:stretch>
@@ -10347,7 +9955,7 @@
       </w:r>
     </w:p>
     <w:sectPr>
-      <w:footerReference w:type="default" r:id="rId44"/>
+      <w:footerReference w:type="default" r:id="rId37"/>
       <w:pgSz w:w="11906" w:h="16838"/>
       <w:pgMar w:top="1134" w:right="850" w:bottom="1134" w:left="1417" w:header="720" w:footer="720" w:gutter="0"/>
       <w:cols w:space="720"/>

</xml_diff>